<commit_message>
Viajes, iniciar sesion, registrarse
</commit_message>
<xml_diff>
--- a/Documentacion/Documentacion tecnica.docx
+++ b/Documentacion/Documentacion tecnica.docx
@@ -2616,8 +2616,6 @@
         </w:rPr>
         <w:br w:type="page"/>
       </w:r>
-      <w:bookmarkStart w:id="0" w:name="_GoBack"/>
-      <w:bookmarkEnd w:id="0"/>
     </w:p>
     <w:p>
       <w:pPr>
@@ -4921,13 +4919,813 @@
           <w:lang w:val="es-MX"/>
         </w:rPr>
       </w:pPr>
-      <w:r>
+    </w:p>
+    <w:p>
+      <w:pPr>
         <w:rPr>
           <w:rFonts w:ascii="Bookman Old Style" w:hAnsi="Bookman Old Style"/>
           <w:b/>
           <w:sz w:val="28"/>
           <w:lang w:val="es-MX"/>
         </w:rPr>
+      </w:pPr>
+    </w:p>
+    <w:p>
+      <w:pPr>
+        <w:rPr>
+          <w:rFonts w:ascii="Bookman Old Style" w:hAnsi="Bookman Old Style"/>
+          <w:b/>
+          <w:sz w:val="28"/>
+          <w:lang w:val="es-MX"/>
+        </w:rPr>
+      </w:pPr>
+    </w:p>
+    <w:p>
+      <w:pPr>
+        <w:jc w:val="both"/>
+        <w:rPr>
+          <w:rFonts w:asciiTheme="majorHAnsi" w:hAnsiTheme="majorHAnsi" w:cstheme="majorHAnsi"/>
+          <w:lang w:val="es-MX"/>
+        </w:rPr>
+      </w:pPr>
+      <w:r>
+        <w:rPr>
+          <w:rFonts w:asciiTheme="majorHAnsi" w:hAnsiTheme="majorHAnsi" w:cstheme="majorHAnsi"/>
+          <w:lang w:val="es-MX"/>
+        </w:rPr>
+        <w:t xml:space="preserve">La infraestructura </w:t>
+      </w:r>
+      <w:proofErr w:type="spellStart"/>
+      <w:r>
+        <w:rPr>
+          <w:rFonts w:asciiTheme="majorHAnsi" w:hAnsiTheme="majorHAnsi" w:cstheme="majorHAnsi"/>
+          <w:lang w:val="es-MX"/>
+        </w:rPr>
+        <w:t>backend</w:t>
+      </w:r>
+      <w:proofErr w:type="spellEnd"/>
+      <w:r>
+        <w:rPr>
+          <w:rFonts w:asciiTheme="majorHAnsi" w:hAnsiTheme="majorHAnsi" w:cstheme="majorHAnsi"/>
+          <w:lang w:val="es-MX"/>
+        </w:rPr>
+        <w:t xml:space="preserve"> del sistema se apoya principalmente en </w:t>
+      </w:r>
+      <w:proofErr w:type="spellStart"/>
+      <w:r>
+        <w:rPr>
+          <w:rFonts w:asciiTheme="majorHAnsi" w:hAnsiTheme="majorHAnsi" w:cstheme="majorHAnsi"/>
+          <w:lang w:val="es-MX"/>
+        </w:rPr>
+        <w:t>Supabase</w:t>
+      </w:r>
+      <w:proofErr w:type="spellEnd"/>
+      <w:r>
+        <w:rPr>
+          <w:rFonts w:asciiTheme="majorHAnsi" w:hAnsiTheme="majorHAnsi" w:cstheme="majorHAnsi"/>
+          <w:lang w:val="es-MX"/>
+        </w:rPr>
+        <w:t xml:space="preserve">, utilizado como el componente encargado de administrar autenticación, persistencia de datos, control de sesiones y almacenamiento general de la información generada dentro de la plataforma. Su incorporación permite centralizar operaciones críticas relacionadas con usuarios, viajes y configuraciones persistentes sin necesidad de desarrollar manualmente una infraestructura </w:t>
+      </w:r>
+      <w:proofErr w:type="spellStart"/>
+      <w:r>
+        <w:rPr>
+          <w:rFonts w:asciiTheme="majorHAnsi" w:hAnsiTheme="majorHAnsi" w:cstheme="majorHAnsi"/>
+          <w:lang w:val="es-MX"/>
+        </w:rPr>
+        <w:t>backend</w:t>
+      </w:r>
+      <w:proofErr w:type="spellEnd"/>
+      <w:r>
+        <w:rPr>
+          <w:rFonts w:asciiTheme="majorHAnsi" w:hAnsiTheme="majorHAnsi" w:cstheme="majorHAnsi"/>
+          <w:lang w:val="es-MX"/>
+        </w:rPr>
+        <w:t xml:space="preserve"> completa desde las primeras etapas del proyecto.</w:t>
+      </w:r>
+    </w:p>
+    <w:p>
+      <w:pPr>
+        <w:jc w:val="both"/>
+        <w:rPr>
+          <w:rFonts w:asciiTheme="majorHAnsi" w:hAnsiTheme="majorHAnsi" w:cstheme="majorHAnsi"/>
+          <w:lang w:val="es-MX"/>
+        </w:rPr>
+      </w:pPr>
+      <w:r>
+        <w:rPr>
+          <w:rFonts w:asciiTheme="majorHAnsi" w:hAnsiTheme="majorHAnsi" w:cstheme="majorHAnsi"/>
+          <w:lang w:val="es-MX"/>
+        </w:rPr>
+        <w:t xml:space="preserve">Dentro de la arquitectura implementada, </w:t>
+      </w:r>
+      <w:proofErr w:type="spellStart"/>
+      <w:r>
+        <w:rPr>
+          <w:rFonts w:asciiTheme="majorHAnsi" w:hAnsiTheme="majorHAnsi" w:cstheme="majorHAnsi"/>
+          <w:lang w:val="es-MX"/>
+        </w:rPr>
+        <w:t>Supabase</w:t>
+      </w:r>
+      <w:proofErr w:type="spellEnd"/>
+      <w:r>
+        <w:rPr>
+          <w:rFonts w:asciiTheme="majorHAnsi" w:hAnsiTheme="majorHAnsi" w:cstheme="majorHAnsi"/>
+          <w:lang w:val="es-MX"/>
+        </w:rPr>
+        <w:t xml:space="preserve"> funciona como el núcleo de administración de información persistente del sistema. A través de esta infraestructura se almacenan datos vinculados a cuentas de usuario, itinerarios, preferencias de viaje, configuraciones personalizadas, actividades organizadas y demás elementos necesarios para sostener continuidad operativa entre distintas sesiones y dispositivos. Esta persistencia permite que la información generada durante la planificación permanezca disponible de manera estable y accesible a lo largo del tiempo.</w:t>
+      </w:r>
+    </w:p>
+    <w:p>
+      <w:pPr>
+        <w:jc w:val="both"/>
+        <w:rPr>
+          <w:rFonts w:asciiTheme="majorHAnsi" w:hAnsiTheme="majorHAnsi" w:cstheme="majorHAnsi"/>
+          <w:lang w:val="es-MX"/>
+        </w:rPr>
+      </w:pPr>
+      <w:r>
+        <w:rPr>
+          <w:rFonts w:asciiTheme="majorHAnsi" w:hAnsiTheme="majorHAnsi" w:cstheme="majorHAnsi"/>
+          <w:lang w:val="es-MX"/>
+        </w:rPr>
+        <w:t xml:space="preserve">Uno de los principales roles de </w:t>
+      </w:r>
+      <w:proofErr w:type="spellStart"/>
+      <w:r>
+        <w:rPr>
+          <w:rFonts w:asciiTheme="majorHAnsi" w:hAnsiTheme="majorHAnsi" w:cstheme="majorHAnsi"/>
+          <w:lang w:val="es-MX"/>
+        </w:rPr>
+        <w:t>Supabase</w:t>
+      </w:r>
+      <w:proofErr w:type="spellEnd"/>
+      <w:r>
+        <w:rPr>
+          <w:rFonts w:asciiTheme="majorHAnsi" w:hAnsiTheme="majorHAnsi" w:cstheme="majorHAnsi"/>
+          <w:lang w:val="es-MX"/>
+        </w:rPr>
+        <w:t xml:space="preserve"> dentro del proyecto consiste en la gestión de autenticación y control de acceso. El sistema delega sobre esta infraestructura procesos relacionados con validación de credenciales, administración de sesiones activas y protección de información asociada a cada cuenta. Esto permite mantener aisladas operaciones sensibles vinculadas a seguridad y reduce considerablemente la complejidad de implementar mecanismos propios de autenticación desde cero.</w:t>
+      </w:r>
+    </w:p>
+    <w:p>
+      <w:pPr>
+        <w:jc w:val="both"/>
+        <w:rPr>
+          <w:rFonts w:asciiTheme="majorHAnsi" w:hAnsiTheme="majorHAnsi" w:cstheme="majorHAnsi"/>
+          <w:lang w:val="es-MX"/>
+        </w:rPr>
+      </w:pPr>
+      <w:r>
+        <w:rPr>
+          <w:rFonts w:asciiTheme="majorHAnsi" w:hAnsiTheme="majorHAnsi" w:cstheme="majorHAnsi"/>
+          <w:lang w:val="es-MX"/>
+        </w:rPr>
+        <w:t xml:space="preserve">La integración entre </w:t>
+      </w:r>
+      <w:proofErr w:type="spellStart"/>
+      <w:r>
+        <w:rPr>
+          <w:rFonts w:asciiTheme="majorHAnsi" w:hAnsiTheme="majorHAnsi" w:cstheme="majorHAnsi"/>
+          <w:lang w:val="es-MX"/>
+        </w:rPr>
+        <w:t>frontend</w:t>
+      </w:r>
+      <w:proofErr w:type="spellEnd"/>
+      <w:r>
+        <w:rPr>
+          <w:rFonts w:asciiTheme="majorHAnsi" w:hAnsiTheme="majorHAnsi" w:cstheme="majorHAnsi"/>
+          <w:lang w:val="es-MX"/>
+        </w:rPr>
+        <w:t xml:space="preserve"> y </w:t>
+      </w:r>
+      <w:proofErr w:type="spellStart"/>
+      <w:r>
+        <w:rPr>
+          <w:rFonts w:asciiTheme="majorHAnsi" w:hAnsiTheme="majorHAnsi" w:cstheme="majorHAnsi"/>
+          <w:lang w:val="es-MX"/>
+        </w:rPr>
+        <w:t>backend</w:t>
+      </w:r>
+      <w:proofErr w:type="spellEnd"/>
+      <w:r>
+        <w:rPr>
+          <w:rFonts w:asciiTheme="majorHAnsi" w:hAnsiTheme="majorHAnsi" w:cstheme="majorHAnsi"/>
+          <w:lang w:val="es-MX"/>
+        </w:rPr>
+        <w:t xml:space="preserve"> se realiza mediante solicitudes dinámicas administradas desde JavaScript, permitiendo sincronizar continuamente información entre la interfaz y la base de datos. A través de este flujo, la plataforma puede recuperar viajes almacenados, actualizar configuraciones, registrar modificaciones realizadas durante la planificación y mantener persistencia sobre cambios efectuados en tiempo real por el usuario.</w:t>
+      </w:r>
+    </w:p>
+    <w:p>
+      <w:pPr>
+        <w:jc w:val="both"/>
+        <w:rPr>
+          <w:rFonts w:asciiTheme="majorHAnsi" w:hAnsiTheme="majorHAnsi" w:cstheme="majorHAnsi"/>
+          <w:lang w:val="es-MX"/>
+        </w:rPr>
+      </w:pPr>
+      <w:r>
+        <w:rPr>
+          <w:rFonts w:asciiTheme="majorHAnsi" w:hAnsiTheme="majorHAnsi" w:cstheme="majorHAnsi"/>
+          <w:lang w:val="es-MX"/>
+        </w:rPr>
+        <w:t xml:space="preserve">La utilización de </w:t>
+      </w:r>
+      <w:proofErr w:type="spellStart"/>
+      <w:r>
+        <w:rPr>
+          <w:rFonts w:asciiTheme="majorHAnsi" w:hAnsiTheme="majorHAnsi" w:cstheme="majorHAnsi"/>
+          <w:lang w:val="es-MX"/>
+        </w:rPr>
+        <w:t>Supabase</w:t>
+      </w:r>
+      <w:proofErr w:type="spellEnd"/>
+      <w:r>
+        <w:rPr>
+          <w:rFonts w:asciiTheme="majorHAnsi" w:hAnsiTheme="majorHAnsi" w:cstheme="majorHAnsi"/>
+          <w:lang w:val="es-MX"/>
+        </w:rPr>
+        <w:t xml:space="preserve"> también favorece una arquitectura más modular y escalable dentro del sistema. Al separar almacenamiento, autenticación y lógica visual en componentes relativamente independientes, la plataforma puede evolucionar progresivamente sin necesidad de reestructurar completamente su funcionamiento interno. Esto facilita tanto la incorporación futura de nuevas funcionalidades como la posibilidad de migrar determinados servicios hacia soluciones más complejas en etapas posteriores del proyecto si el crecimiento operativo así lo requiere.</w:t>
+      </w:r>
+    </w:p>
+    <w:p>
+      <w:pPr>
+        <w:jc w:val="both"/>
+        <w:rPr>
+          <w:rFonts w:asciiTheme="majorHAnsi" w:hAnsiTheme="majorHAnsi" w:cstheme="majorHAnsi"/>
+          <w:lang w:val="es-MX"/>
+        </w:rPr>
+      </w:pPr>
+      <w:r>
+        <w:rPr>
+          <w:rFonts w:asciiTheme="majorHAnsi" w:hAnsiTheme="majorHAnsi" w:cstheme="majorHAnsi"/>
+          <w:lang w:val="es-MX"/>
+        </w:rPr>
+        <w:t xml:space="preserve">A nivel operativo, esta infraestructura permite además reducir tiempos de desarrollo y mantenimiento, ya que gran parte de las funcionalidades </w:t>
+      </w:r>
+      <w:proofErr w:type="spellStart"/>
+      <w:r>
+        <w:rPr>
+          <w:rFonts w:asciiTheme="majorHAnsi" w:hAnsiTheme="majorHAnsi" w:cstheme="majorHAnsi"/>
+          <w:lang w:val="es-MX"/>
+        </w:rPr>
+        <w:t>backend</w:t>
+      </w:r>
+      <w:proofErr w:type="spellEnd"/>
+      <w:r>
+        <w:rPr>
+          <w:rFonts w:asciiTheme="majorHAnsi" w:hAnsiTheme="majorHAnsi" w:cstheme="majorHAnsi"/>
+          <w:lang w:val="es-MX"/>
+        </w:rPr>
+        <w:t xml:space="preserve"> esenciales se encuentran centralizadas dentro de una plataforma especializada. Bajo este enfoque, el proyecto puede concentrar mayor parte de su complejidad técnica en la experiencia de planificación, personalización </w:t>
+      </w:r>
+      <w:r>
+        <w:rPr>
+          <w:rFonts w:asciiTheme="majorHAnsi" w:hAnsiTheme="majorHAnsi" w:cstheme="majorHAnsi"/>
+          <w:lang w:val="es-MX"/>
+        </w:rPr>
+        <w:lastRenderedPageBreak/>
+        <w:t>y coordinación dinámica de viajes, manteniendo al mismo tiempo una base estable para administración de usuarios y persistencia de información.</w:t>
+      </w:r>
+    </w:p>
+    <w:p>
+      <w:pPr>
+        <w:jc w:val="both"/>
+        <w:rPr>
+          <w:rFonts w:asciiTheme="majorHAnsi" w:hAnsiTheme="majorHAnsi" w:cstheme="majorHAnsi"/>
+          <w:lang w:val="es-MX"/>
+        </w:rPr>
+      </w:pPr>
+      <w:r>
+        <w:rPr>
+          <w:rFonts w:asciiTheme="majorHAnsi" w:hAnsiTheme="majorHAnsi" w:cstheme="majorHAnsi"/>
+          <w:lang w:val="es-MX"/>
+        </w:rPr>
+        <w:t xml:space="preserve">La administración de usuarios y autenticación constituye uno de los pilares operativos del </w:t>
+      </w:r>
+      <w:proofErr w:type="spellStart"/>
+      <w:r>
+        <w:rPr>
+          <w:rFonts w:asciiTheme="majorHAnsi" w:hAnsiTheme="majorHAnsi" w:cstheme="majorHAnsi"/>
+          <w:lang w:val="es-MX"/>
+        </w:rPr>
+        <w:t>backend</w:t>
+      </w:r>
+      <w:proofErr w:type="spellEnd"/>
+      <w:r>
+        <w:rPr>
+          <w:rFonts w:asciiTheme="majorHAnsi" w:hAnsiTheme="majorHAnsi" w:cstheme="majorHAnsi"/>
+          <w:lang w:val="es-MX"/>
+        </w:rPr>
+        <w:t>, ya que permite establecer una relación persistente entre cada cuenta y la información generada dentro de la plataforma. A través de este sistema, el proyecto puede identificar individualmente a cada usuario, controlar accesos, mantener sesiones activas y garantizar que los datos asociados a la planificación de viajes permanezcan organizados dentro de entornos privados e independientes.</w:t>
+      </w:r>
+    </w:p>
+    <w:p>
+      <w:pPr>
+        <w:jc w:val="both"/>
+        <w:rPr>
+          <w:rFonts w:asciiTheme="majorHAnsi" w:hAnsiTheme="majorHAnsi" w:cstheme="majorHAnsi"/>
+          <w:lang w:val="es-MX"/>
+        </w:rPr>
+      </w:pPr>
+      <w:r>
+        <w:rPr>
+          <w:rFonts w:asciiTheme="majorHAnsi" w:hAnsiTheme="majorHAnsi" w:cstheme="majorHAnsi"/>
+          <w:lang w:val="es-MX"/>
+        </w:rPr>
+        <w:t xml:space="preserve">El proceso de autenticación se encuentra centralizado mediante </w:t>
+      </w:r>
+      <w:proofErr w:type="spellStart"/>
+      <w:r>
+        <w:rPr>
+          <w:rFonts w:asciiTheme="majorHAnsi" w:hAnsiTheme="majorHAnsi" w:cstheme="majorHAnsi"/>
+          <w:lang w:val="es-MX"/>
+        </w:rPr>
+        <w:t>Supabase</w:t>
+      </w:r>
+      <w:proofErr w:type="spellEnd"/>
+      <w:r>
+        <w:rPr>
+          <w:rFonts w:asciiTheme="majorHAnsi" w:hAnsiTheme="majorHAnsi" w:cstheme="majorHAnsi"/>
+          <w:lang w:val="es-MX"/>
+        </w:rPr>
+        <w:t>, encargado de gestionar validación de credenciales, creación de cuentas y administración de sesiones persistentes. Esta implementación permite delegar operaciones sensibles vinculadas a identificación y control de acceso sobre una infraestructura especializada, reduciendo complejidad de desarrollo y fortaleciendo estabilidad operativa dentro del sistema.</w:t>
+      </w:r>
+    </w:p>
+    <w:p>
+      <w:pPr>
+        <w:jc w:val="both"/>
+        <w:rPr>
+          <w:rFonts w:asciiTheme="majorHAnsi" w:hAnsiTheme="majorHAnsi" w:cstheme="majorHAnsi"/>
+          <w:lang w:val="es-MX"/>
+        </w:rPr>
+      </w:pPr>
+      <w:r>
+        <w:rPr>
+          <w:rFonts w:asciiTheme="majorHAnsi" w:hAnsiTheme="majorHAnsi" w:cstheme="majorHAnsi"/>
+          <w:lang w:val="es-MX"/>
+        </w:rPr>
+        <w:t>Una vez autenticado, cada usuario obtiene acceso a un entorno reservado donde se concentra toda la información vinculada a sus actividades dentro de la plataforma. Este espacio privado permite almacenar viajes, configuraciones personalizadas, preferencias, historial de planificación y demás datos generados durante el uso del sistema, manteniendo separación estructural entre la información perteneciente a distintas cuentas registradas.</w:t>
+      </w:r>
+    </w:p>
+    <w:p>
+      <w:pPr>
+        <w:jc w:val="both"/>
+        <w:rPr>
+          <w:rFonts w:asciiTheme="majorHAnsi" w:hAnsiTheme="majorHAnsi" w:cstheme="majorHAnsi"/>
+          <w:lang w:val="es-MX"/>
+        </w:rPr>
+      </w:pPr>
+      <w:r>
+        <w:rPr>
+          <w:rFonts w:asciiTheme="majorHAnsi" w:hAnsiTheme="majorHAnsi" w:cstheme="majorHAnsi"/>
+          <w:lang w:val="es-MX"/>
+        </w:rPr>
+        <w:t>La persistencia de sesiones cumple además un rol importante dentro de la continuidad operativa de la plataforma. Debido a que los procesos de planificación suelen desarrollarse progresivamente y pueden extenderse a lo largo del tiempo, el sistema mantiene estados de autenticación activos que permiten retomar configuraciones y viajes previamente almacenados sin necesidad de reiniciar continuamente el proceso de acceso. Esto favorece una experiencia de uso más fluida y adaptable entre distintas sesiones o dispositivos compatibles.</w:t>
+      </w:r>
+    </w:p>
+    <w:p>
+      <w:pPr>
+        <w:jc w:val="both"/>
+        <w:rPr>
+          <w:rFonts w:asciiTheme="majorHAnsi" w:hAnsiTheme="majorHAnsi" w:cstheme="majorHAnsi"/>
+          <w:lang w:val="es-MX"/>
+        </w:rPr>
+      </w:pPr>
+      <w:r>
+        <w:rPr>
+          <w:rFonts w:asciiTheme="majorHAnsi" w:hAnsiTheme="majorHAnsi" w:cstheme="majorHAnsi"/>
+          <w:lang w:val="es-MX"/>
+        </w:rPr>
+        <w:t xml:space="preserve">A nivel estructural, la autenticación funciona también como un mecanismo de organización interna de información dentro del </w:t>
+      </w:r>
+      <w:proofErr w:type="spellStart"/>
+      <w:r>
+        <w:rPr>
+          <w:rFonts w:asciiTheme="majorHAnsi" w:hAnsiTheme="majorHAnsi" w:cstheme="majorHAnsi"/>
+          <w:lang w:val="es-MX"/>
+        </w:rPr>
+        <w:t>backend</w:t>
+      </w:r>
+      <w:proofErr w:type="spellEnd"/>
+      <w:r>
+        <w:rPr>
+          <w:rFonts w:asciiTheme="majorHAnsi" w:hAnsiTheme="majorHAnsi" w:cstheme="majorHAnsi"/>
+          <w:lang w:val="es-MX"/>
+        </w:rPr>
+        <w:t>. La relación entre usuario y datos almacenados permite que el sistema administre configuraciones individuales, personalice comportamientos operativos y mantenga coherencia entre preferencias registradas y funcionalidades utilizadas dentro de la plataforma. Esta lógica facilita además futuras ampliaciones relacionadas con recomendaciones personalizadas, sincronización avanzada o herramientas colaborativas vinculadas a planificación de viajes.</w:t>
+      </w:r>
+    </w:p>
+    <w:p>
+      <w:pPr>
+        <w:jc w:val="both"/>
+        <w:rPr>
+          <w:rFonts w:asciiTheme="majorHAnsi" w:hAnsiTheme="majorHAnsi" w:cstheme="majorHAnsi"/>
+          <w:lang w:val="es-MX"/>
+        </w:rPr>
+      </w:pPr>
+      <w:r>
+        <w:rPr>
+          <w:rFonts w:asciiTheme="majorHAnsi" w:hAnsiTheme="majorHAnsi" w:cstheme="majorHAnsi"/>
+          <w:lang w:val="es-MX"/>
+        </w:rPr>
+        <w:t>La separación de accesos y el aislamiento de información entre cuentas contribuyen asimismo a fortalecer la seguridad general del sistema. Cada usuario interactúa exclusivamente con los datos asociados a su entorno privado, reduciendo riesgos de exposición involuntaria de información y permitiendo mantener una estructura más organizada para administración de almacenamiento y control de permisos dentro de la plataforma.</w:t>
+      </w:r>
+    </w:p>
+    <w:p>
+      <w:pPr>
+        <w:jc w:val="both"/>
+        <w:rPr>
+          <w:rFonts w:asciiTheme="majorHAnsi" w:hAnsiTheme="majorHAnsi" w:cstheme="majorHAnsi"/>
+          <w:lang w:val="es-MX"/>
+        </w:rPr>
+      </w:pPr>
+      <w:r>
+        <w:rPr>
+          <w:rFonts w:asciiTheme="majorHAnsi" w:hAnsiTheme="majorHAnsi" w:cstheme="majorHAnsi"/>
+          <w:lang w:val="es-MX"/>
+        </w:rPr>
+        <w:t>La estructura implementada busca representar de manera organizada las relaciones existentes entre usuarios, itinerarios, actividades, preferencias, configuraciones y demás elementos necesarios para el funcionamiento general del sistema. Cada entidad cumple un rol específico dentro del modelo de almacenamiento y puede vincularse con otras áreas de información para construir una representación más completa del contexto operativo de cada viaje.</w:t>
+      </w:r>
+    </w:p>
+    <w:p>
+      <w:pPr>
+        <w:jc w:val="both"/>
+        <w:rPr>
+          <w:rFonts w:asciiTheme="majorHAnsi" w:hAnsiTheme="majorHAnsi" w:cstheme="majorHAnsi"/>
+          <w:lang w:val="es-MX"/>
+        </w:rPr>
+      </w:pPr>
+      <w:r>
+        <w:rPr>
+          <w:rFonts w:asciiTheme="majorHAnsi" w:hAnsiTheme="majorHAnsi" w:cstheme="majorHAnsi"/>
+          <w:lang w:val="es-MX"/>
+        </w:rPr>
+        <w:t xml:space="preserve">Dentro de esta lógica, la cuenta de usuario funciona como el eje principal de organización de información persistente. A partir de ella se estructuran relaciones vinculadas a viajes creados, configuraciones personalizadas, historial de planificación y futuras interacciones realizadas dentro de la plataforma. Este enfoque permite mantener aislamiento entre datos pertenecientes a distintas </w:t>
+      </w:r>
+      <w:r>
+        <w:rPr>
+          <w:rFonts w:asciiTheme="majorHAnsi" w:hAnsiTheme="majorHAnsi" w:cstheme="majorHAnsi"/>
+          <w:lang w:val="es-MX"/>
+        </w:rPr>
+        <w:lastRenderedPageBreak/>
+        <w:t>cuentas mientras facilita recuperación y administración progresiva de información asociada a cada entorno privado.</w:t>
+      </w:r>
+    </w:p>
+    <w:p>
+      <w:pPr>
+        <w:jc w:val="both"/>
+        <w:rPr>
+          <w:rFonts w:asciiTheme="majorHAnsi" w:hAnsiTheme="majorHAnsi" w:cstheme="majorHAnsi"/>
+          <w:lang w:val="es-MX"/>
+        </w:rPr>
+      </w:pPr>
+      <w:r>
+        <w:rPr>
+          <w:rFonts w:asciiTheme="majorHAnsi" w:hAnsiTheme="majorHAnsi" w:cstheme="majorHAnsi"/>
+          <w:lang w:val="es-MX"/>
+        </w:rPr>
+        <w:t>La estructura relacional de la base de datos permite además sostener una lógica flexible frente a modificaciones constantes durante el proceso de planificación. Actividades, rutas, destinos y configuraciones pueden reorganizarse dinámicamente sin comprometer consistencia general del almacenamiento, favoreciendo una administración más adaptable frente a cambios frecuentes dentro del itinerario.</w:t>
+      </w:r>
+    </w:p>
+    <w:p>
+      <w:pPr>
+        <w:jc w:val="both"/>
+        <w:rPr>
+          <w:rFonts w:asciiTheme="majorHAnsi" w:hAnsiTheme="majorHAnsi" w:cstheme="majorHAnsi"/>
+          <w:lang w:val="es-MX"/>
+        </w:rPr>
+      </w:pPr>
+      <w:r>
+        <w:rPr>
+          <w:rFonts w:asciiTheme="majorHAnsi" w:hAnsiTheme="majorHAnsi" w:cstheme="majorHAnsi"/>
+          <w:lang w:val="es-MX"/>
+        </w:rPr>
+        <w:t>A nivel arquitectónico, el modelo de organización de datos también contempla capacidad de expansión futura. La separación modular entre entidades facilita incorporación de nuevas relaciones, integración de servicios adicionales y ampliación progresiva del ecosistema de funcionalidades sin necesidad de rediseñar completamente la estructura existente. Esto permite que la base de datos evolucione junto al crecimiento general del proyecto manteniendo coherencia estructural entre almacenamiento, procesamiento y personalización operativa del sistema.</w:t>
+      </w:r>
+    </w:p>
+    <w:p>
+      <w:pPr>
+        <w:jc w:val="both"/>
+        <w:rPr>
+          <w:rFonts w:asciiTheme="majorHAnsi" w:hAnsiTheme="majorHAnsi" w:cstheme="majorHAnsi"/>
+          <w:lang w:val="es-MX"/>
+        </w:rPr>
+      </w:pPr>
+    </w:p>
+    <w:p>
+      <w:pPr>
+        <w:jc w:val="both"/>
+        <w:rPr>
+          <w:rFonts w:ascii="Bookman Old Style" w:hAnsi="Bookman Old Style"/>
+          <w:b/>
+          <w:sz w:val="28"/>
+          <w:lang w:val="es-MX"/>
+        </w:rPr>
+      </w:pPr>
+      <w:r>
+        <w:rPr>
+          <w:rFonts w:ascii="Bookman Old Style" w:hAnsi="Bookman Old Style"/>
+          <w:b/>
+          <w:sz w:val="28"/>
+          <w:lang w:val="es-MX"/>
+        </w:rPr>
+        <w:drawing>
+          <wp:inline distT="0" distB="0" distL="0" distR="0" wp14:anchorId="624E73CA" wp14:editId="76BD09CF">
+            <wp:extent cx="5733415" cy="5467350"/>
+            <wp:effectExtent l="0" t="0" r="635" b="0"/>
+            <wp:docPr id="1" name="Imagen 1"/>
+            <wp:cNvGraphicFramePr>
+              <a:graphicFrameLocks xmlns:a="http://schemas.openxmlformats.org/drawingml/2006/main" noChangeAspect="1"/>
+            </wp:cNvGraphicFramePr>
+            <a:graphic xmlns:a="http://schemas.openxmlformats.org/drawingml/2006/main">
+              <a:graphicData uri="http://schemas.openxmlformats.org/drawingml/2006/picture">
+                <pic:pic xmlns:pic="http://schemas.openxmlformats.org/drawingml/2006/picture">
+                  <pic:nvPicPr>
+                    <pic:cNvPr id="1" name=""/>
+                    <pic:cNvPicPr/>
+                  </pic:nvPicPr>
+                  <pic:blipFill>
+                    <a:blip r:embed="rId6"/>
+                    <a:stretch>
+                      <a:fillRect/>
+                    </a:stretch>
+                  </pic:blipFill>
+                  <pic:spPr>
+                    <a:xfrm>
+                      <a:off x="0" y="0"/>
+                      <a:ext cx="5733415" cy="5467350"/>
+                    </a:xfrm>
+                    <a:prstGeom prst="rect">
+                      <a:avLst/>
+                    </a:prstGeom>
+                  </pic:spPr>
+                </pic:pic>
+              </a:graphicData>
+            </a:graphic>
+          </wp:inline>
+        </w:drawing>
+      </w:r>
+      <w:r>
+        <w:rPr>
+          <w:rFonts w:ascii="Bookman Old Style" w:hAnsi="Bookman Old Style"/>
+          <w:b/>
+          <w:sz w:val="28"/>
+          <w:lang w:val="es-MX"/>
+        </w:rPr>
+        <w:t xml:space="preserve"> </w:t>
+      </w:r>
+    </w:p>
+    <w:p>
+      <w:pPr>
+        <w:jc w:val="both"/>
+        <w:rPr>
+          <w:rFonts w:ascii="Bookman Old Style" w:hAnsi="Bookman Old Style"/>
+          <w:b/>
+          <w:sz w:val="28"/>
+          <w:lang w:val="es-MX"/>
+        </w:rPr>
+      </w:pPr>
+    </w:p>
+    <w:p>
+      <w:pPr>
+        <w:jc w:val="both"/>
+        <w:rPr>
+          <w:rFonts w:asciiTheme="majorHAnsi" w:hAnsiTheme="majorHAnsi" w:cstheme="majorHAnsi"/>
+          <w:lang w:val="es-MX"/>
+        </w:rPr>
+      </w:pPr>
+      <w:r>
+        <w:rPr>
+          <w:rFonts w:asciiTheme="majorHAnsi" w:hAnsiTheme="majorHAnsi" w:cstheme="majorHAnsi"/>
+          <w:lang w:val="es-MX"/>
+        </w:rPr>
+        <w:t xml:space="preserve">La comunicación entre </w:t>
+      </w:r>
+      <w:proofErr w:type="spellStart"/>
+      <w:r>
+        <w:rPr>
+          <w:rFonts w:asciiTheme="majorHAnsi" w:hAnsiTheme="majorHAnsi" w:cstheme="majorHAnsi"/>
+          <w:lang w:val="es-MX"/>
+        </w:rPr>
+        <w:t>frontend</w:t>
+      </w:r>
+      <w:proofErr w:type="spellEnd"/>
+      <w:r>
+        <w:rPr>
+          <w:rFonts w:asciiTheme="majorHAnsi" w:hAnsiTheme="majorHAnsi" w:cstheme="majorHAnsi"/>
+          <w:lang w:val="es-MX"/>
+        </w:rPr>
+        <w:t xml:space="preserve"> y </w:t>
+      </w:r>
+      <w:proofErr w:type="spellStart"/>
+      <w:r>
+        <w:rPr>
+          <w:rFonts w:asciiTheme="majorHAnsi" w:hAnsiTheme="majorHAnsi" w:cstheme="majorHAnsi"/>
+          <w:lang w:val="es-MX"/>
+        </w:rPr>
+        <w:t>backend</w:t>
+      </w:r>
+      <w:proofErr w:type="spellEnd"/>
+      <w:r>
+        <w:rPr>
+          <w:rFonts w:asciiTheme="majorHAnsi" w:hAnsiTheme="majorHAnsi" w:cstheme="majorHAnsi"/>
+          <w:lang w:val="es-MX"/>
+        </w:rPr>
+        <w:t xml:space="preserve"> se desarrolla mediante un sistema de intercambio dinámico de información encargado de mantener sincronización constante entre la interfaz de </w:t>
+      </w:r>
+      <w:r>
+        <w:rPr>
+          <w:rFonts w:asciiTheme="majorHAnsi" w:hAnsiTheme="majorHAnsi" w:cstheme="majorHAnsi"/>
+          <w:lang w:val="es-MX"/>
+        </w:rPr>
+        <w:lastRenderedPageBreak/>
+        <w:t>usuario, la base de datos y los distintos servicios integrados dentro de la plataforma. Esta interacción permite que las acciones realizadas durante el proceso de planificación impacten de manera inmediata sobre la información persistente del sistema, garantizando continuidad operativa y actualización permanente de los datos administrados por la aplicación.</w:t>
+      </w:r>
+    </w:p>
+    <w:p>
+      <w:pPr>
+        <w:jc w:val="both"/>
+        <w:rPr>
+          <w:rFonts w:asciiTheme="majorHAnsi" w:hAnsiTheme="majorHAnsi" w:cstheme="majorHAnsi"/>
+          <w:lang w:val="es-MX"/>
+        </w:rPr>
+      </w:pPr>
+      <w:r>
+        <w:rPr>
+          <w:rFonts w:asciiTheme="majorHAnsi" w:hAnsiTheme="majorHAnsi" w:cstheme="majorHAnsi"/>
+          <w:lang w:val="es-MX"/>
+        </w:rPr>
+        <w:t xml:space="preserve">El </w:t>
+      </w:r>
+      <w:proofErr w:type="spellStart"/>
+      <w:r>
+        <w:rPr>
+          <w:rFonts w:asciiTheme="majorHAnsi" w:hAnsiTheme="majorHAnsi" w:cstheme="majorHAnsi"/>
+          <w:lang w:val="es-MX"/>
+        </w:rPr>
+        <w:t>frontend</w:t>
+      </w:r>
+      <w:proofErr w:type="spellEnd"/>
+      <w:r>
+        <w:rPr>
+          <w:rFonts w:asciiTheme="majorHAnsi" w:hAnsiTheme="majorHAnsi" w:cstheme="majorHAnsi"/>
+          <w:lang w:val="es-MX"/>
+        </w:rPr>
+        <w:t xml:space="preserve"> utiliza JavaScript como intermediario principal para realizar solicitudes hacia la infraestructura </w:t>
+      </w:r>
+      <w:proofErr w:type="spellStart"/>
+      <w:r>
+        <w:rPr>
+          <w:rFonts w:asciiTheme="majorHAnsi" w:hAnsiTheme="majorHAnsi" w:cstheme="majorHAnsi"/>
+          <w:lang w:val="es-MX"/>
+        </w:rPr>
+        <w:t>backend</w:t>
+      </w:r>
+      <w:proofErr w:type="spellEnd"/>
+      <w:r>
+        <w:rPr>
+          <w:rFonts w:asciiTheme="majorHAnsi" w:hAnsiTheme="majorHAnsi" w:cstheme="majorHAnsi"/>
+          <w:lang w:val="es-MX"/>
+        </w:rPr>
+        <w:t>, recuperando y enviando información relacionada con usuarios, itinerarios, configuraciones y actividades almacenadas dentro de la base de datos. Estas solicitudes se ejecutan de manera asincrónica, permitiendo mantener una experiencia de navegación fluida incluso mientras se procesan operaciones vinculadas a almacenamiento, autenticación o sincronización de contenido.</w:t>
+      </w:r>
+    </w:p>
+    <w:p>
+      <w:pPr>
+        <w:jc w:val="both"/>
+        <w:rPr>
+          <w:rFonts w:asciiTheme="majorHAnsi" w:hAnsiTheme="majorHAnsi" w:cstheme="majorHAnsi"/>
+          <w:lang w:val="es-MX"/>
+        </w:rPr>
+      </w:pPr>
+      <w:r>
+        <w:rPr>
+          <w:rFonts w:asciiTheme="majorHAnsi" w:hAnsiTheme="majorHAnsi" w:cstheme="majorHAnsi"/>
+          <w:lang w:val="es-MX"/>
+        </w:rPr>
+        <w:t xml:space="preserve">Dentro de este flujo, el </w:t>
+      </w:r>
+      <w:proofErr w:type="spellStart"/>
+      <w:r>
+        <w:rPr>
+          <w:rFonts w:asciiTheme="majorHAnsi" w:hAnsiTheme="majorHAnsi" w:cstheme="majorHAnsi"/>
+          <w:lang w:val="es-MX"/>
+        </w:rPr>
+        <w:t>backend</w:t>
+      </w:r>
+      <w:proofErr w:type="spellEnd"/>
+      <w:r>
+        <w:rPr>
+          <w:rFonts w:asciiTheme="majorHAnsi" w:hAnsiTheme="majorHAnsi" w:cstheme="majorHAnsi"/>
+          <w:lang w:val="es-MX"/>
+        </w:rPr>
+        <w:t xml:space="preserve"> actúa como el componente encargado de validar, administrar y persistir la información intercambiada entre las distintas capas del sistema. Cada modificación realizada desde la interfaz puede generar procesos de actualización sobre registros almacenados, recuperación de configuraciones previas o sincronización de cambios aplicados sobre estructuras vinculadas al viaje en construcción.</w:t>
+      </w:r>
+    </w:p>
+    <w:p>
+      <w:pPr>
+        <w:jc w:val="both"/>
+        <w:rPr>
+          <w:rFonts w:asciiTheme="majorHAnsi" w:hAnsiTheme="majorHAnsi" w:cstheme="majorHAnsi"/>
+          <w:lang w:val="es-MX"/>
+        </w:rPr>
+      </w:pPr>
+      <w:r>
+        <w:rPr>
+          <w:rFonts w:asciiTheme="majorHAnsi" w:hAnsiTheme="majorHAnsi" w:cstheme="majorHAnsi"/>
+          <w:lang w:val="es-MX"/>
+        </w:rPr>
+        <w:t>La comunicación dinámica entre ambas capas resulta especialmente importante debido a la naturaleza progresiva y adaptable de la plataforma. El sistema debe permitir que itinerarios, actividades y preferencias puedan modificarse continuamente sin comprometer consistencia de datos ni estabilidad operativa entre sesiones. Para ello, la sincronización entre interfaz y almacenamiento se realiza de manera permanente durante gran parte de la interacción del usuario con la aplicación.</w:t>
+      </w:r>
+    </w:p>
+    <w:p>
+      <w:pPr>
+        <w:jc w:val="both"/>
+        <w:rPr>
+          <w:rFonts w:asciiTheme="majorHAnsi" w:hAnsiTheme="majorHAnsi" w:cstheme="majorHAnsi"/>
+          <w:lang w:val="es-MX"/>
+        </w:rPr>
+      </w:pPr>
+      <w:r>
+        <w:rPr>
+          <w:rFonts w:asciiTheme="majorHAnsi" w:hAnsiTheme="majorHAnsi" w:cstheme="majorHAnsi"/>
+          <w:lang w:val="es-MX"/>
+        </w:rPr>
+        <w:t xml:space="preserve">A nivel funcional, esta arquitectura de comunicación también permite desacoplar parcialmente la lógica visual del procesamiento y persistencia de información. Mientras el </w:t>
+      </w:r>
+      <w:proofErr w:type="spellStart"/>
+      <w:r>
+        <w:rPr>
+          <w:rFonts w:asciiTheme="majorHAnsi" w:hAnsiTheme="majorHAnsi" w:cstheme="majorHAnsi"/>
+          <w:lang w:val="es-MX"/>
+        </w:rPr>
+        <w:t>frontend</w:t>
+      </w:r>
+      <w:proofErr w:type="spellEnd"/>
+      <w:r>
+        <w:rPr>
+          <w:rFonts w:asciiTheme="majorHAnsi" w:hAnsiTheme="majorHAnsi" w:cstheme="majorHAnsi"/>
+          <w:lang w:val="es-MX"/>
+        </w:rPr>
+        <w:t xml:space="preserve"> se concentra en administrar interacción, representación y experiencia de usuario, el </w:t>
+      </w:r>
+      <w:proofErr w:type="spellStart"/>
+      <w:r>
+        <w:rPr>
+          <w:rFonts w:asciiTheme="majorHAnsi" w:hAnsiTheme="majorHAnsi" w:cstheme="majorHAnsi"/>
+          <w:lang w:val="es-MX"/>
+        </w:rPr>
+        <w:t>backend</w:t>
+      </w:r>
+      <w:proofErr w:type="spellEnd"/>
+      <w:r>
+        <w:rPr>
+          <w:rFonts w:asciiTheme="majorHAnsi" w:hAnsiTheme="majorHAnsi" w:cstheme="majorHAnsi"/>
+          <w:lang w:val="es-MX"/>
+        </w:rPr>
+        <w:t xml:space="preserve"> centraliza operaciones relacionadas con autenticación, almacenamiento y organización estructural de datos. Esta separación favorece una estructura más </w:t>
+      </w:r>
+      <w:proofErr w:type="spellStart"/>
+      <w:r>
+        <w:rPr>
+          <w:rFonts w:asciiTheme="majorHAnsi" w:hAnsiTheme="majorHAnsi" w:cstheme="majorHAnsi"/>
+          <w:lang w:val="es-MX"/>
+        </w:rPr>
+        <w:t>mantenible</w:t>
+      </w:r>
+      <w:proofErr w:type="spellEnd"/>
+      <w:r>
+        <w:rPr>
+          <w:rFonts w:asciiTheme="majorHAnsi" w:hAnsiTheme="majorHAnsi" w:cstheme="majorHAnsi"/>
+          <w:lang w:val="es-MX"/>
+        </w:rPr>
+        <w:t>, facilita futuras ampliaciones del sistema y reduce dependencia directa entre componentes internos de la plataforma.</w:t>
+      </w:r>
+    </w:p>
+    <w:p>
+      <w:pPr>
+        <w:jc w:val="both"/>
+        <w:rPr>
+          <w:rFonts w:asciiTheme="majorHAnsi" w:hAnsiTheme="majorHAnsi" w:cstheme="majorHAnsi"/>
+          <w:lang w:val="es-MX"/>
+        </w:rPr>
+      </w:pPr>
+      <w:r>
+        <w:rPr>
+          <w:rFonts w:ascii="Bookman Old Style" w:hAnsi="Bookman Old Style"/>
+          <w:b/>
+          <w:lang w:val="es-MX"/>
+        </w:rPr>
+        <w:t xml:space="preserve"> </w:t>
+      </w:r>
+      <w:r>
+        <w:rPr>
+          <w:rFonts w:ascii="Bookman Old Style" w:hAnsi="Bookman Old Style"/>
+          <w:b/>
+          <w:sz w:val="28"/>
+          <w:lang w:val="es-MX"/>
+        </w:rPr>
         <w:br w:type="page"/>
       </w:r>
     </w:p>
@@ -5023,8 +5821,1201 @@
           <w:sz w:val="28"/>
           <w:lang w:val="es-MX"/>
         </w:rPr>
-        <w:t>Base de Datos</w:t>
-      </w:r>
+        <w:t>Servicios Externos</w:t>
+      </w:r>
+    </w:p>
+    <w:p>
+      <w:pPr>
+        <w:jc w:val="both"/>
+        <w:rPr>
+          <w:rFonts w:ascii="Bookman Old Style" w:hAnsi="Bookman Old Style"/>
+          <w:b/>
+          <w:sz w:val="28"/>
+          <w:lang w:val="es-MX"/>
+        </w:rPr>
+      </w:pPr>
+    </w:p>
+    <w:p>
+      <w:pPr>
+        <w:jc w:val="both"/>
+        <w:rPr>
+          <w:rFonts w:ascii="Bookman Old Style" w:hAnsi="Bookman Old Style"/>
+          <w:b/>
+          <w:sz w:val="28"/>
+          <w:lang w:val="es-MX"/>
+        </w:rPr>
+      </w:pPr>
+    </w:p>
+    <w:p>
+      <w:pPr>
+        <w:jc w:val="both"/>
+        <w:rPr>
+          <w:rFonts w:ascii="Bookman Old Style" w:hAnsi="Bookman Old Style"/>
+          <w:b/>
+          <w:sz w:val="28"/>
+          <w:lang w:val="es-MX"/>
+        </w:rPr>
+      </w:pPr>
+    </w:p>
+    <w:p>
+      <w:pPr>
+        <w:jc w:val="both"/>
+        <w:rPr>
+          <w:rFonts w:asciiTheme="majorHAnsi" w:hAnsiTheme="majorHAnsi" w:cstheme="majorHAnsi"/>
+          <w:lang w:val="es-MX"/>
+        </w:rPr>
+      </w:pPr>
+      <w:r>
+        <w:rPr>
+          <w:rFonts w:asciiTheme="majorHAnsi" w:hAnsiTheme="majorHAnsi" w:cstheme="majorHAnsi"/>
+          <w:lang w:val="es-MX"/>
+        </w:rPr>
+        <w:t>La plataforma incorpora distintos servicios externos especializados con el objetivo de complementar funcionalidades internas del sistema y ampliar las capacidades operativas disponibles durante el proceso de planificación del viaje. Esta integración permite delegar tareas específicas sobre herramientas desarrolladas para áreas particulares —como representación cartográfica, información contextual, sincronización temporal o gestión de servicios complementarios— evitando replicar internamente infraestructuras de alta complejidad y favoreciendo un desarrollo más flexible y escalable.</w:t>
+      </w:r>
+    </w:p>
+    <w:p>
+      <w:pPr>
+        <w:jc w:val="both"/>
+        <w:rPr>
+          <w:rFonts w:asciiTheme="majorHAnsi" w:hAnsiTheme="majorHAnsi" w:cstheme="majorHAnsi"/>
+          <w:lang w:val="es-MX"/>
+        </w:rPr>
+      </w:pPr>
+      <w:r>
+        <w:rPr>
+          <w:rFonts w:asciiTheme="majorHAnsi" w:hAnsiTheme="majorHAnsi" w:cstheme="majorHAnsi"/>
+          <w:lang w:val="es-MX"/>
+        </w:rPr>
+        <w:t xml:space="preserve">Dentro de la arquitectura general del proyecto, los servicios externos funcionan como componentes integrados que interactúan continuamente con el </w:t>
+      </w:r>
+      <w:proofErr w:type="spellStart"/>
+      <w:r>
+        <w:rPr>
+          <w:rFonts w:asciiTheme="majorHAnsi" w:hAnsiTheme="majorHAnsi" w:cstheme="majorHAnsi"/>
+          <w:lang w:val="es-MX"/>
+        </w:rPr>
+        <w:t>frontend</w:t>
+      </w:r>
+      <w:proofErr w:type="spellEnd"/>
+      <w:r>
+        <w:rPr>
+          <w:rFonts w:asciiTheme="majorHAnsi" w:hAnsiTheme="majorHAnsi" w:cstheme="majorHAnsi"/>
+          <w:lang w:val="es-MX"/>
+        </w:rPr>
+        <w:t xml:space="preserve"> y la infraestructura </w:t>
+      </w:r>
+      <w:proofErr w:type="spellStart"/>
+      <w:r>
+        <w:rPr>
+          <w:rFonts w:asciiTheme="majorHAnsi" w:hAnsiTheme="majorHAnsi" w:cstheme="majorHAnsi"/>
+          <w:lang w:val="es-MX"/>
+        </w:rPr>
+        <w:t>backend</w:t>
+      </w:r>
+      <w:proofErr w:type="spellEnd"/>
+      <w:r>
+        <w:rPr>
+          <w:rFonts w:asciiTheme="majorHAnsi" w:hAnsiTheme="majorHAnsi" w:cstheme="majorHAnsi"/>
+          <w:lang w:val="es-MX"/>
+        </w:rPr>
+        <w:t xml:space="preserve"> mediante solicitudes dinámicas administradas por la plataforma. Gracias a esta comunicación, el sistema puede recuperar información, sincronizar contenido y actualizar datos en tiempo real sin interrumpir la experiencia de uso ni fragmentar el entorno de planificación.</w:t>
+      </w:r>
+    </w:p>
+    <w:p>
+      <w:pPr>
+        <w:jc w:val="both"/>
+        <w:rPr>
+          <w:rFonts w:asciiTheme="majorHAnsi" w:hAnsiTheme="majorHAnsi" w:cstheme="majorHAnsi"/>
+          <w:lang w:val="es-MX"/>
+        </w:rPr>
+      </w:pPr>
+      <w:r>
+        <w:rPr>
+          <w:rFonts w:asciiTheme="majorHAnsi" w:hAnsiTheme="majorHAnsi" w:cstheme="majorHAnsi"/>
+          <w:lang w:val="es-MX"/>
+        </w:rPr>
+        <w:t xml:space="preserve">La utilización de </w:t>
+      </w:r>
+      <w:proofErr w:type="spellStart"/>
+      <w:r>
+        <w:rPr>
+          <w:rFonts w:asciiTheme="majorHAnsi" w:hAnsiTheme="majorHAnsi" w:cstheme="majorHAnsi"/>
+          <w:lang w:val="es-MX"/>
+        </w:rPr>
+        <w:t>APIs</w:t>
+      </w:r>
+      <w:proofErr w:type="spellEnd"/>
+      <w:r>
+        <w:rPr>
+          <w:rFonts w:asciiTheme="majorHAnsi" w:hAnsiTheme="majorHAnsi" w:cstheme="majorHAnsi"/>
+          <w:lang w:val="es-MX"/>
+        </w:rPr>
+        <w:t xml:space="preserve"> y herramientas externas resulta especialmente importante debido a la naturaleza centralizadora del proyecto. La plataforma no busca limitarse únicamente a organizar información generada manualmente por el usuario, sino consolidar un entorno capaz de combinar planificación, exploración, visualización y administración operativa dentro de una misma experiencia integrada. Para ello, la arquitectura se apoya sobre servicios especializados que permiten enriquecer progresivamente funcionalidades relacionadas con mapas, referencias turísticas, sincronización de actividades y futuras conexiones con proveedores externos.</w:t>
+      </w:r>
+    </w:p>
+    <w:p>
+      <w:pPr>
+        <w:jc w:val="both"/>
+        <w:rPr>
+          <w:rFonts w:asciiTheme="majorHAnsi" w:hAnsiTheme="majorHAnsi" w:cstheme="majorHAnsi"/>
+          <w:b/>
+          <w:sz w:val="24"/>
+          <w:lang w:val="es-MX"/>
+        </w:rPr>
+      </w:pPr>
+    </w:p>
+    <w:p>
+      <w:pPr>
+        <w:jc w:val="both"/>
+        <w:rPr>
+          <w:rFonts w:asciiTheme="majorHAnsi" w:hAnsiTheme="majorHAnsi" w:cstheme="majorHAnsi"/>
+          <w:b/>
+          <w:sz w:val="24"/>
+          <w:lang w:val="es-MX"/>
+        </w:rPr>
+      </w:pPr>
+      <w:r>
+        <w:rPr>
+          <w:rFonts w:asciiTheme="majorHAnsi" w:hAnsiTheme="majorHAnsi" w:cstheme="majorHAnsi"/>
+          <w:b/>
+          <w:sz w:val="24"/>
+          <w:lang w:val="es-MX"/>
+        </w:rPr>
+        <w:t xml:space="preserve">Integración Cartográfica – Google </w:t>
+      </w:r>
+      <w:proofErr w:type="spellStart"/>
+      <w:r>
+        <w:rPr>
+          <w:rFonts w:asciiTheme="majorHAnsi" w:hAnsiTheme="majorHAnsi" w:cstheme="majorHAnsi"/>
+          <w:b/>
+          <w:sz w:val="24"/>
+          <w:lang w:val="es-MX"/>
+        </w:rPr>
+        <w:t>Maps</w:t>
+      </w:r>
+      <w:proofErr w:type="spellEnd"/>
+    </w:p>
+    <w:p>
+      <w:pPr>
+        <w:jc w:val="both"/>
+        <w:rPr>
+          <w:rFonts w:asciiTheme="majorHAnsi" w:hAnsiTheme="majorHAnsi" w:cstheme="majorHAnsi"/>
+          <w:b/>
+          <w:sz w:val="24"/>
+          <w:lang w:val="es-MX"/>
+        </w:rPr>
+      </w:pPr>
+    </w:p>
+    <w:p>
+      <w:pPr>
+        <w:jc w:val="both"/>
+        <w:rPr>
+          <w:rFonts w:asciiTheme="majorHAnsi" w:hAnsiTheme="majorHAnsi" w:cstheme="majorHAnsi"/>
+          <w:lang w:val="es-MX"/>
+        </w:rPr>
+      </w:pPr>
+      <w:r>
+        <w:rPr>
+          <w:rFonts w:asciiTheme="majorHAnsi" w:hAnsiTheme="majorHAnsi" w:cstheme="majorHAnsi"/>
+          <w:lang w:val="es-MX"/>
+        </w:rPr>
+        <w:t xml:space="preserve">La plataforma incorpora Google </w:t>
+      </w:r>
+      <w:proofErr w:type="spellStart"/>
+      <w:r>
+        <w:rPr>
+          <w:rFonts w:asciiTheme="majorHAnsi" w:hAnsiTheme="majorHAnsi" w:cstheme="majorHAnsi"/>
+          <w:lang w:val="es-MX"/>
+        </w:rPr>
+        <w:t>Maps</w:t>
+      </w:r>
+      <w:proofErr w:type="spellEnd"/>
+      <w:r>
+        <w:rPr>
+          <w:rFonts w:asciiTheme="majorHAnsi" w:hAnsiTheme="majorHAnsi" w:cstheme="majorHAnsi"/>
+          <w:lang w:val="es-MX"/>
+        </w:rPr>
+        <w:t xml:space="preserve"> como uno de los principales servicios externos destinados a la representación cartográfica, visualización espacial y administración de información geográfica dentro del sistema de planificación de viajes. Su integración permite complementar la organización estructural del itinerario mediante herramientas visuales e interactivas orientadas a mejorar comprensión espacial, distribución de recorridos y análisis general del viaje configurado por el usuario.</w:t>
+      </w:r>
+    </w:p>
+    <w:p>
+      <w:pPr>
+        <w:jc w:val="both"/>
+        <w:rPr>
+          <w:rFonts w:asciiTheme="majorHAnsi" w:hAnsiTheme="majorHAnsi" w:cstheme="majorHAnsi"/>
+          <w:lang w:val="es-MX"/>
+        </w:rPr>
+      </w:pPr>
+      <w:r>
+        <w:rPr>
+          <w:rFonts w:asciiTheme="majorHAnsi" w:hAnsiTheme="majorHAnsi" w:cstheme="majorHAnsi"/>
+          <w:lang w:val="es-MX"/>
+        </w:rPr>
+        <w:t xml:space="preserve">Dentro del funcionamiento de la plataforma, Google </w:t>
+      </w:r>
+      <w:proofErr w:type="spellStart"/>
+      <w:r>
+        <w:rPr>
+          <w:rFonts w:asciiTheme="majorHAnsi" w:hAnsiTheme="majorHAnsi" w:cstheme="majorHAnsi"/>
+          <w:lang w:val="es-MX"/>
+        </w:rPr>
+        <w:t>Maps</w:t>
+      </w:r>
+      <w:proofErr w:type="spellEnd"/>
+      <w:r>
+        <w:rPr>
+          <w:rFonts w:asciiTheme="majorHAnsi" w:hAnsiTheme="majorHAnsi" w:cstheme="majorHAnsi"/>
+          <w:lang w:val="es-MX"/>
+        </w:rPr>
+        <w:t xml:space="preserve"> actúa como el componente encargado de representar ubicaciones, rutas, puntos de interés y relaciones geográficas entre las distintas actividades organizadas durante el proceso de planificación. Esta integración permite transformar información estructural almacenada dentro del sistema en representaciones visuales dinámicas capaces de facilitar interpretación logística y organización espacial del itinerario.</w:t>
+      </w:r>
+    </w:p>
+    <w:p>
+      <w:pPr>
+        <w:jc w:val="both"/>
+        <w:rPr>
+          <w:rFonts w:asciiTheme="majorHAnsi" w:hAnsiTheme="majorHAnsi" w:cstheme="majorHAnsi"/>
+          <w:lang w:val="es-MX"/>
+        </w:rPr>
+      </w:pPr>
+      <w:r>
+        <w:rPr>
+          <w:rFonts w:asciiTheme="majorHAnsi" w:hAnsiTheme="majorHAnsi" w:cstheme="majorHAnsi"/>
+          <w:lang w:val="es-MX"/>
+        </w:rPr>
+        <w:lastRenderedPageBreak/>
+        <w:t xml:space="preserve">La interacción con el servicio cartográfico se administra desde el </w:t>
+      </w:r>
+      <w:proofErr w:type="spellStart"/>
+      <w:r>
+        <w:rPr>
+          <w:rFonts w:asciiTheme="majorHAnsi" w:hAnsiTheme="majorHAnsi" w:cstheme="majorHAnsi"/>
+          <w:lang w:val="es-MX"/>
+        </w:rPr>
+        <w:t>frontend</w:t>
+      </w:r>
+      <w:proofErr w:type="spellEnd"/>
+      <w:r>
+        <w:rPr>
+          <w:rFonts w:asciiTheme="majorHAnsi" w:hAnsiTheme="majorHAnsi" w:cstheme="majorHAnsi"/>
+          <w:lang w:val="es-MX"/>
+        </w:rPr>
+        <w:t xml:space="preserve"> mediante JavaScript, encargado de realizar solicitudes dinámicas, actualizar representaciones visuales y sincronizar información geográfica con el resto de los componentes activos dentro de la interfaz. Gracias a esta comunicación continua, el sistema puede reflejar modificaciones realizadas sobre destinos, recorridos o actividades de manera inmediata dentro del entorno cartográfico sin necesidad de recargar completamente la plataforma.</w:t>
+      </w:r>
+    </w:p>
+    <w:p>
+      <w:pPr>
+        <w:jc w:val="both"/>
+        <w:rPr>
+          <w:rFonts w:asciiTheme="majorHAnsi" w:hAnsiTheme="majorHAnsi" w:cstheme="majorHAnsi"/>
+          <w:lang w:val="es-MX"/>
+        </w:rPr>
+      </w:pPr>
+      <w:r>
+        <w:rPr>
+          <w:rFonts w:asciiTheme="majorHAnsi" w:hAnsiTheme="majorHAnsi" w:cstheme="majorHAnsi"/>
+          <w:lang w:val="es-MX"/>
+        </w:rPr>
+        <w:drawing>
+          <wp:anchor distT="0" distB="0" distL="114300" distR="114300" simplePos="0" relativeHeight="251658240" behindDoc="1" locked="0" layoutInCell="1" allowOverlap="1" wp14:anchorId="6DF6A8E6" wp14:editId="53D00552">
+            <wp:simplePos x="0" y="0"/>
+            <wp:positionH relativeFrom="margin">
+              <wp:align>right</wp:align>
+            </wp:positionH>
+            <wp:positionV relativeFrom="paragraph">
+              <wp:posOffset>10160</wp:posOffset>
+            </wp:positionV>
+            <wp:extent cx="2861945" cy="2505075"/>
+            <wp:effectExtent l="0" t="0" r="0" b="9525"/>
+            <wp:wrapTight wrapText="bothSides">
+              <wp:wrapPolygon edited="0">
+                <wp:start x="0" y="0"/>
+                <wp:lineTo x="0" y="21518"/>
+                <wp:lineTo x="21423" y="21518"/>
+                <wp:lineTo x="21423" y="0"/>
+                <wp:lineTo x="0" y="0"/>
+              </wp:wrapPolygon>
+            </wp:wrapTight>
+            <wp:docPr id="2" name="Imagen 2"/>
+            <wp:cNvGraphicFramePr>
+              <a:graphicFrameLocks xmlns:a="http://schemas.openxmlformats.org/drawingml/2006/main" noChangeAspect="1"/>
+            </wp:cNvGraphicFramePr>
+            <a:graphic xmlns:a="http://schemas.openxmlformats.org/drawingml/2006/main">
+              <a:graphicData uri="http://schemas.openxmlformats.org/drawingml/2006/picture">
+                <pic:pic xmlns:pic="http://schemas.openxmlformats.org/drawingml/2006/picture">
+                  <pic:nvPicPr>
+                    <pic:cNvPr id="1" name=""/>
+                    <pic:cNvPicPr/>
+                  </pic:nvPicPr>
+                  <pic:blipFill>
+                    <a:blip r:embed="rId7">
+                      <a:extLst>
+                        <a:ext uri="{28A0092B-C50C-407E-A947-70E740481C1C}">
+                          <a14:useLocalDpi xmlns:a14="http://schemas.microsoft.com/office/drawing/2010/main" val="0"/>
+                        </a:ext>
+                      </a:extLst>
+                    </a:blip>
+                    <a:stretch>
+                      <a:fillRect/>
+                    </a:stretch>
+                  </pic:blipFill>
+                  <pic:spPr>
+                    <a:xfrm>
+                      <a:off x="0" y="0"/>
+                      <a:ext cx="2861945" cy="2505075"/>
+                    </a:xfrm>
+                    <a:prstGeom prst="rect">
+                      <a:avLst/>
+                    </a:prstGeom>
+                  </pic:spPr>
+                </pic:pic>
+              </a:graphicData>
+            </a:graphic>
+            <wp14:sizeRelH relativeFrom="margin">
+              <wp14:pctWidth>0</wp14:pctWidth>
+            </wp14:sizeRelH>
+            <wp14:sizeRelV relativeFrom="margin">
+              <wp14:pctHeight>0</wp14:pctHeight>
+            </wp14:sizeRelV>
+          </wp:anchor>
+        </w:drawing>
+      </w:r>
+      <w:r>
+        <w:rPr>
+          <w:rFonts w:asciiTheme="majorHAnsi" w:hAnsiTheme="majorHAnsi" w:cstheme="majorHAnsi"/>
+          <w:lang w:val="es-MX"/>
+        </w:rPr>
+        <w:t xml:space="preserve">La integración de Google </w:t>
+      </w:r>
+      <w:proofErr w:type="spellStart"/>
+      <w:r>
+        <w:rPr>
+          <w:rFonts w:asciiTheme="majorHAnsi" w:hAnsiTheme="majorHAnsi" w:cstheme="majorHAnsi"/>
+          <w:lang w:val="es-MX"/>
+        </w:rPr>
+        <w:t>Maps</w:t>
+      </w:r>
+      <w:proofErr w:type="spellEnd"/>
+      <w:r>
+        <w:rPr>
+          <w:rFonts w:asciiTheme="majorHAnsi" w:hAnsiTheme="majorHAnsi" w:cstheme="majorHAnsi"/>
+          <w:lang w:val="es-MX"/>
+        </w:rPr>
+        <w:t xml:space="preserve"> resulta especialmente importante debido a la naturaleza dinámica y adaptable del proyecto. A medida que el usuario modifica configuraciones del viaje, agrega nuevos puntos de interés o reorganiza actividades dentro del itinerario, la representación cartográfica puede actualizar recorridos, recalcular relaciones espaciales y reorganizar visualmente sectores vinculados al desplazamiento general del viaje. Esto permite mantener coherencia entre planificación estructural y distribución geográfica de las actividades configuradas.</w:t>
+      </w:r>
+      <w:r>
+        <w:rPr>
+          <w:rFonts w:asciiTheme="majorHAnsi" w:hAnsiTheme="majorHAnsi" w:cstheme="majorHAnsi"/>
+          <w:lang w:val="es-MX"/>
+        </w:rPr>
+        <w:t xml:space="preserve"> </w:t>
+      </w:r>
+    </w:p>
+    <w:p>
+      <w:pPr>
+        <w:jc w:val="both"/>
+        <w:rPr>
+          <w:rFonts w:asciiTheme="majorHAnsi" w:hAnsiTheme="majorHAnsi" w:cstheme="majorHAnsi"/>
+          <w:lang w:val="es-MX"/>
+        </w:rPr>
+      </w:pPr>
+      <w:r>
+        <w:rPr>
+          <w:rFonts w:asciiTheme="majorHAnsi" w:hAnsiTheme="majorHAnsi" w:cstheme="majorHAnsi"/>
+          <w:lang w:val="es-MX"/>
+        </w:rPr>
+        <w:t>A nivel operativo, el servicio cartográfico también facilita una comprensión más precisa de factores vinculados a distancias, concentración de recorridos y organización territorial del itinerario. La visualización integrada de ubicaciones permite detectar incompatibilidades logísticas, trayectos ineficientes o distribuciones excesivamente extensas dentro de determinados períodos del viaje, aportando una herramienta complementaria para optimizar planificación y toma de decisiones durante la construcción del recorrido.</w:t>
+      </w:r>
+    </w:p>
+    <w:p>
+      <w:pPr>
+        <w:jc w:val="both"/>
+        <w:rPr>
+          <w:rFonts w:asciiTheme="majorHAnsi" w:hAnsiTheme="majorHAnsi" w:cstheme="majorHAnsi"/>
+          <w:lang w:val="es-MX"/>
+        </w:rPr>
+      </w:pPr>
+      <w:r>
+        <w:rPr>
+          <w:rFonts w:asciiTheme="majorHAnsi" w:hAnsiTheme="majorHAnsi" w:cstheme="majorHAnsi"/>
+          <w:lang w:val="es-MX"/>
+        </w:rPr>
+        <w:t xml:space="preserve">La utilización de Google </w:t>
+      </w:r>
+      <w:proofErr w:type="spellStart"/>
+      <w:r>
+        <w:rPr>
+          <w:rFonts w:asciiTheme="majorHAnsi" w:hAnsiTheme="majorHAnsi" w:cstheme="majorHAnsi"/>
+          <w:lang w:val="es-MX"/>
+        </w:rPr>
+        <w:t>Maps</w:t>
+      </w:r>
+      <w:proofErr w:type="spellEnd"/>
+      <w:r>
+        <w:rPr>
+          <w:rFonts w:asciiTheme="majorHAnsi" w:hAnsiTheme="majorHAnsi" w:cstheme="majorHAnsi"/>
+          <w:lang w:val="es-MX"/>
+        </w:rPr>
+        <w:t xml:space="preserve"> contribuye además a consolidar el enfoque integrador de la plataforma, donde distintos servicios especializados trabajan coordinadamente dentro de una misma experiencia de usuario. Bajo esta lógica, el sistema no se limita únicamente a almacenar actividades o destinos, sino que incorpora herramientas externas capaces de enriquecer visualmente el proceso de planificación y fortalecer capacidad operativa del entorno de gestión de viajes.</w:t>
+      </w:r>
+    </w:p>
+    <w:p>
+      <w:pPr>
+        <w:jc w:val="both"/>
+        <w:rPr>
+          <w:rFonts w:asciiTheme="majorHAnsi" w:hAnsiTheme="majorHAnsi" w:cstheme="majorHAnsi"/>
+          <w:lang w:val="es-MX"/>
+        </w:rPr>
+      </w:pPr>
+    </w:p>
+    <w:p>
+      <w:pPr>
+        <w:jc w:val="both"/>
+        <w:rPr>
+          <w:rFonts w:asciiTheme="majorHAnsi" w:hAnsiTheme="majorHAnsi" w:cstheme="majorHAnsi"/>
+          <w:b/>
+          <w:sz w:val="24"/>
+          <w:lang w:val="es-MX"/>
+        </w:rPr>
+      </w:pPr>
+    </w:p>
+    <w:p>
+      <w:pPr>
+        <w:jc w:val="both"/>
+        <w:rPr>
+          <w:rFonts w:asciiTheme="majorHAnsi" w:hAnsiTheme="majorHAnsi" w:cstheme="majorHAnsi"/>
+          <w:b/>
+          <w:sz w:val="24"/>
+          <w:lang w:val="es-MX"/>
+        </w:rPr>
+      </w:pPr>
+      <w:r>
+        <w:rPr>
+          <w:rFonts w:asciiTheme="majorHAnsi" w:hAnsiTheme="majorHAnsi" w:cstheme="majorHAnsi"/>
+          <w:b/>
+          <w:sz w:val="24"/>
+          <w:lang w:val="es-MX"/>
+        </w:rPr>
+        <w:t xml:space="preserve">Integración Cartográfica – Google </w:t>
+      </w:r>
+      <w:proofErr w:type="spellStart"/>
+      <w:r>
+        <w:rPr>
+          <w:rFonts w:asciiTheme="majorHAnsi" w:hAnsiTheme="majorHAnsi" w:cstheme="majorHAnsi"/>
+          <w:b/>
+          <w:sz w:val="24"/>
+          <w:lang w:val="es-MX"/>
+        </w:rPr>
+        <w:t>Maps</w:t>
+      </w:r>
+      <w:proofErr w:type="spellEnd"/>
+    </w:p>
+    <w:p>
+      <w:pPr>
+        <w:jc w:val="both"/>
+        <w:rPr>
+          <w:rFonts w:asciiTheme="majorHAnsi" w:hAnsiTheme="majorHAnsi" w:cstheme="majorHAnsi"/>
+          <w:b/>
+          <w:sz w:val="24"/>
+          <w:lang w:val="es-MX"/>
+        </w:rPr>
+      </w:pPr>
+    </w:p>
+    <w:p>
+      <w:pPr>
+        <w:jc w:val="both"/>
+        <w:rPr>
+          <w:rFonts w:asciiTheme="majorHAnsi" w:hAnsiTheme="majorHAnsi" w:cstheme="majorHAnsi"/>
+          <w:lang w:val="es-MX"/>
+        </w:rPr>
+      </w:pPr>
+      <w:r>
+        <w:rPr>
+          <w:rFonts w:asciiTheme="majorHAnsi" w:hAnsiTheme="majorHAnsi" w:cstheme="majorHAnsi"/>
+          <w:lang w:val="es-MX"/>
+        </w:rPr>
+        <w:t xml:space="preserve">La plataforma incorpora </w:t>
+      </w:r>
+      <w:proofErr w:type="spellStart"/>
+      <w:r>
+        <w:rPr>
+          <w:rFonts w:asciiTheme="majorHAnsi" w:hAnsiTheme="majorHAnsi" w:cstheme="majorHAnsi"/>
+          <w:lang w:val="es-MX"/>
+        </w:rPr>
+        <w:t>Wikivoyage</w:t>
+      </w:r>
+      <w:proofErr w:type="spellEnd"/>
+      <w:r>
+        <w:rPr>
+          <w:rFonts w:asciiTheme="majorHAnsi" w:hAnsiTheme="majorHAnsi" w:cstheme="majorHAnsi"/>
+          <w:lang w:val="es-MX"/>
+        </w:rPr>
+        <w:t xml:space="preserve"> como una de las principales fuentes externas de información contextual y contenido turístico, permitiendo complementar el proceso de planificación mediante acceso integrado a descripciones, referencias y datos relevantes sobre destinos, ciudades y puntos de interés incluidos dentro del itinerario del usuario. Su integración cumple un rol fundamental dentro del sistema, ya que transforma la planificación del viaje en un entorno no solo organizativo, sino también informativo y exploratorio.</w:t>
+      </w:r>
+    </w:p>
+    <w:p>
+      <w:pPr>
+        <w:jc w:val="both"/>
+        <w:rPr>
+          <w:rFonts w:asciiTheme="majorHAnsi" w:hAnsiTheme="majorHAnsi" w:cstheme="majorHAnsi"/>
+          <w:lang w:val="es-MX"/>
+        </w:rPr>
+      </w:pPr>
+      <w:r>
+        <w:rPr>
+          <w:rFonts w:asciiTheme="majorHAnsi" w:hAnsiTheme="majorHAnsi" w:cstheme="majorHAnsi"/>
+          <w:lang w:val="es-MX"/>
+        </w:rPr>
+        <w:t>A través de esta integración, la plataforma puede recuperar contenido relacionado con ubicaciones específicas y presentarlo directamente dentro de la interfaz de planificación, evitando que el usuario deba abandonar el sistema para buscar información adicional sobre los lugares incorporados a su recorrido. Esto permite centralizar gran parte del proceso de investigación y organización del viaje dentro de una única experiencia operativa.</w:t>
+      </w:r>
+    </w:p>
+    <w:p>
+      <w:pPr>
+        <w:jc w:val="both"/>
+        <w:rPr>
+          <w:rFonts w:asciiTheme="majorHAnsi" w:hAnsiTheme="majorHAnsi" w:cstheme="majorHAnsi"/>
+          <w:lang w:val="es-MX"/>
+        </w:rPr>
+      </w:pPr>
+      <w:r>
+        <w:rPr>
+          <w:rFonts w:asciiTheme="majorHAnsi" w:hAnsiTheme="majorHAnsi" w:cstheme="majorHAnsi"/>
+          <w:lang w:val="es-MX"/>
+        </w:rPr>
+        <w:lastRenderedPageBreak/>
+        <w:t xml:space="preserve">La utilización de </w:t>
+      </w:r>
+      <w:proofErr w:type="spellStart"/>
+      <w:r>
+        <w:rPr>
+          <w:rFonts w:asciiTheme="majorHAnsi" w:hAnsiTheme="majorHAnsi" w:cstheme="majorHAnsi"/>
+          <w:lang w:val="es-MX"/>
+        </w:rPr>
+        <w:t>Wikivoyage</w:t>
+      </w:r>
+      <w:proofErr w:type="spellEnd"/>
+      <w:r>
+        <w:rPr>
+          <w:rFonts w:asciiTheme="majorHAnsi" w:hAnsiTheme="majorHAnsi" w:cstheme="majorHAnsi"/>
+          <w:lang w:val="es-MX"/>
+        </w:rPr>
+        <w:t xml:space="preserve"> resulta especialmente importante debido a que gran parte de las decisiones tomadas durante la planificación dependen del contexto asociado a cada destino. Información vinculada a características culturales, actividades recomendadas, sectores turísticos, referencias históricas, medios de transporte o sugerencias generales puede influir directamente sobre la organización del itinerario y sobre la selección de actividades realizadas por el usuario.</w:t>
+      </w:r>
+    </w:p>
+    <w:p>
+      <w:pPr>
+        <w:jc w:val="both"/>
+        <w:rPr>
+          <w:rFonts w:asciiTheme="majorHAnsi" w:hAnsiTheme="majorHAnsi" w:cstheme="majorHAnsi"/>
+          <w:lang w:val="es-MX"/>
+        </w:rPr>
+      </w:pPr>
+      <w:r>
+        <w:rPr>
+          <w:rFonts w:asciiTheme="majorHAnsi" w:hAnsiTheme="majorHAnsi" w:cstheme="majorHAnsi"/>
+          <w:lang w:val="es-MX"/>
+        </w:rPr>
+        <w:t xml:space="preserve">La recuperación y administración de este contenido se realiza dinámicamente mediante solicitudes coordinadas desde el </w:t>
+      </w:r>
+      <w:proofErr w:type="spellStart"/>
+      <w:r>
+        <w:rPr>
+          <w:rFonts w:asciiTheme="majorHAnsi" w:hAnsiTheme="majorHAnsi" w:cstheme="majorHAnsi"/>
+          <w:lang w:val="es-MX"/>
+        </w:rPr>
+        <w:t>frontend</w:t>
+      </w:r>
+      <w:proofErr w:type="spellEnd"/>
+      <w:r>
+        <w:rPr>
+          <w:rFonts w:asciiTheme="majorHAnsi" w:hAnsiTheme="majorHAnsi" w:cstheme="majorHAnsi"/>
+          <w:lang w:val="es-MX"/>
+        </w:rPr>
+        <w:t>, permitiendo cargar información contextual asociada a destinos específicos en función de las acciones realizadas dentro de la plataforma. De esta manera, la información presentada puede adaptarse progresivamente al estado actual del viaje, mostrando contenido relevante según ubicaciones seleccionadas, recorridos configurados o intereses definidos durante la planificación.</w:t>
+      </w:r>
+    </w:p>
+    <w:p>
+      <w:pPr>
+        <w:jc w:val="both"/>
+        <w:rPr>
+          <w:rFonts w:asciiTheme="majorHAnsi" w:hAnsiTheme="majorHAnsi" w:cstheme="majorHAnsi"/>
+          <w:lang w:val="es-MX"/>
+        </w:rPr>
+      </w:pPr>
+      <w:r>
+        <w:rPr>
+          <w:rFonts w:asciiTheme="majorHAnsi" w:hAnsiTheme="majorHAnsi" w:cstheme="majorHAnsi"/>
+          <w:lang w:val="es-MX"/>
+        </w:rPr>
+        <w:t>A nivel funcional, esta integración también contribuye a enriquecer la experiencia de usuario mediante una lógica de planificación más asistida y contextualizada. La plataforma no se limita únicamente a administrar fechas, recorridos y actividades, sino que incorpora herramientas capaces de aportar información complementaria útil para toma de decisiones, exploración de alternativas y comprensión general de los destinos incluidos dentro del viaje.</w:t>
+      </w:r>
+    </w:p>
+    <w:p>
+      <w:pPr>
+        <w:jc w:val="both"/>
+        <w:rPr>
+          <w:rFonts w:asciiTheme="majorHAnsi" w:hAnsiTheme="majorHAnsi" w:cstheme="majorHAnsi"/>
+          <w:lang w:val="es-MX"/>
+        </w:rPr>
+      </w:pPr>
+      <w:r>
+        <w:rPr>
+          <w:rFonts w:asciiTheme="majorHAnsi" w:hAnsiTheme="majorHAnsi" w:cstheme="majorHAnsi"/>
+          <w:lang w:val="es-MX"/>
+        </w:rPr>
+        <w:t xml:space="preserve">La incorporación de </w:t>
+      </w:r>
+      <w:proofErr w:type="spellStart"/>
+      <w:r>
+        <w:rPr>
+          <w:rFonts w:asciiTheme="majorHAnsi" w:hAnsiTheme="majorHAnsi" w:cstheme="majorHAnsi"/>
+          <w:lang w:val="es-MX"/>
+        </w:rPr>
+        <w:t>Wikivoyage</w:t>
+      </w:r>
+      <w:proofErr w:type="spellEnd"/>
+      <w:r>
+        <w:rPr>
+          <w:rFonts w:asciiTheme="majorHAnsi" w:hAnsiTheme="majorHAnsi" w:cstheme="majorHAnsi"/>
+          <w:lang w:val="es-MX"/>
+        </w:rPr>
+        <w:t xml:space="preserve"> fortalece además el enfoque centralizador del proyecto, consolidando a la plataforma como un entorno donde planificación, organización e investigación turística pueden desarrollarse de manera integrada. Gracias a esta conexión con fuentes externas de contenido, el sistema amplía considerablemente sus capacidades informativas sin necesidad de construir manualmente una base propia de referencias turísticas, manteniendo al mismo tiempo una estructura flexible preparada para futuras integraciones de información adicional.</w:t>
+      </w:r>
+    </w:p>
+    <w:p>
+      <w:pPr>
+        <w:jc w:val="both"/>
+        <w:rPr>
+          <w:rFonts w:asciiTheme="majorHAnsi" w:hAnsiTheme="majorHAnsi" w:cstheme="majorHAnsi"/>
+          <w:lang w:val="es-MX"/>
+        </w:rPr>
+      </w:pPr>
+    </w:p>
+    <w:p>
+      <w:pPr>
+        <w:jc w:val="both"/>
+        <w:rPr>
+          <w:rFonts w:asciiTheme="majorHAnsi" w:hAnsiTheme="majorHAnsi" w:cstheme="majorHAnsi"/>
+          <w:lang w:val="es-MX"/>
+        </w:rPr>
+      </w:pPr>
+    </w:p>
+    <w:p>
+      <w:pPr>
+        <w:jc w:val="both"/>
+        <w:rPr>
+          <w:rFonts w:asciiTheme="majorHAnsi" w:hAnsiTheme="majorHAnsi" w:cstheme="majorHAnsi"/>
+          <w:b/>
+          <w:sz w:val="24"/>
+          <w:lang w:val="es-MX"/>
+        </w:rPr>
+      </w:pPr>
+      <w:r>
+        <w:rPr>
+          <w:rFonts w:asciiTheme="majorHAnsi" w:hAnsiTheme="majorHAnsi" w:cstheme="majorHAnsi"/>
+          <w:b/>
+          <w:sz w:val="24"/>
+          <w:lang w:val="es-MX"/>
+        </w:rPr>
+        <w:t>Sincronización Temporal –</w:t>
+      </w:r>
+      <w:r>
+        <w:rPr>
+          <w:rFonts w:asciiTheme="majorHAnsi" w:hAnsiTheme="majorHAnsi" w:cstheme="majorHAnsi"/>
+          <w:b/>
+          <w:sz w:val="24"/>
+          <w:lang w:val="es-MX"/>
+        </w:rPr>
+        <w:t xml:space="preserve"> Google </w:t>
+      </w:r>
+      <w:r>
+        <w:rPr>
+          <w:rFonts w:asciiTheme="majorHAnsi" w:hAnsiTheme="majorHAnsi" w:cstheme="majorHAnsi"/>
+          <w:b/>
+          <w:sz w:val="24"/>
+          <w:lang w:val="es-MX"/>
+        </w:rPr>
+        <w:t>Calendar</w:t>
+      </w:r>
+    </w:p>
+    <w:p>
+      <w:pPr>
+        <w:jc w:val="both"/>
+        <w:rPr>
+          <w:rFonts w:asciiTheme="majorHAnsi" w:hAnsiTheme="majorHAnsi" w:cstheme="majorHAnsi"/>
+          <w:b/>
+          <w:sz w:val="24"/>
+          <w:lang w:val="es-MX"/>
+        </w:rPr>
+      </w:pPr>
+    </w:p>
+    <w:p>
+      <w:pPr>
+        <w:jc w:val="both"/>
+        <w:rPr>
+          <w:rFonts w:asciiTheme="majorHAnsi" w:hAnsiTheme="majorHAnsi" w:cstheme="majorHAnsi"/>
+          <w:lang w:val="es-MX"/>
+        </w:rPr>
+      </w:pPr>
+      <w:r>
+        <w:rPr>
+          <w:rFonts w:asciiTheme="majorHAnsi" w:hAnsiTheme="majorHAnsi" w:cstheme="majorHAnsi"/>
+          <w:lang w:val="es-MX"/>
+        </w:rPr>
+        <w:t>La integración con Google Calendar permite incorporar mecanismos de sincronización temporal y administración cronológica de actividades dentro del proceso general de planificación del viaje. A través de este servicio, la plataforma puede coordinar itinerarios, eventos y configuraciones horarias con calendarios externos del usuario, facilitando una organización más integrada entre la planificación turística y las actividades personales ya existentes fuera del sistema.</w:t>
+      </w:r>
+    </w:p>
+    <w:p>
+      <w:pPr>
+        <w:jc w:val="both"/>
+        <w:rPr>
+          <w:rFonts w:asciiTheme="majorHAnsi" w:hAnsiTheme="majorHAnsi" w:cstheme="majorHAnsi"/>
+          <w:lang w:val="es-MX"/>
+        </w:rPr>
+      </w:pPr>
+      <w:r>
+        <w:rPr>
+          <w:rFonts w:asciiTheme="majorHAnsi" w:hAnsiTheme="majorHAnsi" w:cstheme="majorHAnsi"/>
+          <w:lang w:val="es-MX"/>
+        </w:rPr>
+        <w:t xml:space="preserve">Dentro del funcionamiento de la plataforma, Google Calendar actúa como una herramienta complementaria destinada a mejorar administración temporal del itinerario. Las actividades configuradas durante el proceso de planificación pueden vincularse con estructuras </w:t>
+      </w:r>
+      <w:proofErr w:type="spellStart"/>
+      <w:r>
+        <w:rPr>
+          <w:rFonts w:asciiTheme="majorHAnsi" w:hAnsiTheme="majorHAnsi" w:cstheme="majorHAnsi"/>
+          <w:lang w:val="es-MX"/>
+        </w:rPr>
+        <w:t>calendarias</w:t>
+      </w:r>
+      <w:proofErr w:type="spellEnd"/>
+      <w:r>
+        <w:rPr>
+          <w:rFonts w:asciiTheme="majorHAnsi" w:hAnsiTheme="majorHAnsi" w:cstheme="majorHAnsi"/>
+          <w:lang w:val="es-MX"/>
+        </w:rPr>
+        <w:t xml:space="preserve"> externas, permitiendo mantener una representación más organizada de horarios, fechas y distribuciones diarias del viaje dentro de entornos ya utilizados habitualmente por el usuario.</w:t>
+      </w:r>
+    </w:p>
+    <w:p>
+      <w:pPr>
+        <w:jc w:val="both"/>
+        <w:rPr>
+          <w:rFonts w:asciiTheme="majorHAnsi" w:hAnsiTheme="majorHAnsi" w:cstheme="majorHAnsi"/>
+          <w:lang w:val="es-MX"/>
+        </w:rPr>
+      </w:pPr>
+      <w:r>
+        <w:rPr>
+          <w:rFonts w:asciiTheme="majorHAnsi" w:hAnsiTheme="majorHAnsi" w:cstheme="majorHAnsi"/>
+          <w:lang w:val="es-MX"/>
+        </w:rPr>
+        <w:t>La sincronización con servicios de calendario resulta especialmente importante en viajes donde existen múltiples actividades distribuidas a lo largo de distintos días, horarios y zonas geográficas. La posibilidad de centralizar esta información dentro de un sistema temporal unificado facilita seguimiento operativo del itinerario y reduce riesgos de superposición entre actividades turísticas, compromisos personales o eventos previamente registrados.</w:t>
+      </w:r>
+    </w:p>
+    <w:p>
+      <w:pPr>
+        <w:jc w:val="both"/>
+        <w:rPr>
+          <w:rFonts w:asciiTheme="majorHAnsi" w:hAnsiTheme="majorHAnsi" w:cstheme="majorHAnsi"/>
+          <w:lang w:val="es-MX"/>
+        </w:rPr>
+      </w:pPr>
+      <w:r>
+        <w:rPr>
+          <w:rFonts w:asciiTheme="majorHAnsi" w:hAnsiTheme="majorHAnsi" w:cstheme="majorHAnsi"/>
+          <w:lang w:val="es-MX"/>
+        </w:rPr>
+        <w:t xml:space="preserve">La comunicación entre la plataforma y Google Calendar se administra mediante solicitudes dinámicas controladas desde el </w:t>
+      </w:r>
+      <w:proofErr w:type="spellStart"/>
+      <w:r>
+        <w:rPr>
+          <w:rFonts w:asciiTheme="majorHAnsi" w:hAnsiTheme="majorHAnsi" w:cstheme="majorHAnsi"/>
+          <w:lang w:val="es-MX"/>
+        </w:rPr>
+        <w:t>frontend</w:t>
+      </w:r>
+      <w:proofErr w:type="spellEnd"/>
+      <w:r>
+        <w:rPr>
+          <w:rFonts w:asciiTheme="majorHAnsi" w:hAnsiTheme="majorHAnsi" w:cstheme="majorHAnsi"/>
+          <w:lang w:val="es-MX"/>
+        </w:rPr>
+        <w:t xml:space="preserve">, permitiendo crear, actualizar o reorganizar eventos asociados al viaje según modificaciones realizadas durante la planificación. Gracias a esta integración, cambios efectuados sobre actividades, horarios o recorridos pueden reflejarse progresivamente dentro del </w:t>
+      </w:r>
+      <w:r>
+        <w:rPr>
+          <w:rFonts w:asciiTheme="majorHAnsi" w:hAnsiTheme="majorHAnsi" w:cstheme="majorHAnsi"/>
+          <w:lang w:val="es-MX"/>
+        </w:rPr>
+        <w:lastRenderedPageBreak/>
+        <w:t>calendario sincronizado, manteniendo coherencia entre estructura operativa del sistema y organización temporal externa del usuario.</w:t>
+      </w:r>
+    </w:p>
+    <w:p>
+      <w:pPr>
+        <w:jc w:val="both"/>
+        <w:rPr>
+          <w:rFonts w:asciiTheme="majorHAnsi" w:hAnsiTheme="majorHAnsi" w:cstheme="majorHAnsi"/>
+          <w:lang w:val="es-MX"/>
+        </w:rPr>
+      </w:pPr>
+      <w:r>
+        <w:rPr>
+          <w:rFonts w:asciiTheme="majorHAnsi" w:hAnsiTheme="majorHAnsi" w:cstheme="majorHAnsi"/>
+          <w:lang w:val="es-MX"/>
+        </w:rPr>
+        <w:t>A nivel funcional, esta conexión también favorece una experiencia de planificación más continua y adaptable. El sistema puede utilizar información temporal asociada al viaje para organizar mejor distribución de actividades, identificar posibles conflictos horarios y facilitar visualización cronológica del recorrido general. Esto transforma al itinerario en una estructura más operativa y menos dependiente de configuraciones manuales externas.</w:t>
+      </w:r>
+    </w:p>
+    <w:p>
+      <w:pPr>
+        <w:jc w:val="both"/>
+        <w:rPr>
+          <w:rFonts w:asciiTheme="majorHAnsi" w:hAnsiTheme="majorHAnsi" w:cstheme="majorHAnsi"/>
+          <w:lang w:val="es-MX"/>
+        </w:rPr>
+      </w:pPr>
+      <w:r>
+        <w:rPr>
+          <w:rFonts w:asciiTheme="majorHAnsi" w:hAnsiTheme="majorHAnsi" w:cstheme="majorHAnsi"/>
+          <w:lang w:val="es-MX"/>
+        </w:rPr>
+        <w:t>La incorporación de Google Calendar refuerza además el enfoque integrador de la plataforma, permitiendo conectar herramientas de planificación propias con servicios utilizados cotidianamente fuera del sistema. Bajo esta lógica, el proyecto no busca funcionar como un entorno aislado, sino como una plataforma capaz de integrarse progresivamente con distintos servicios externos para centralizar organización, coordinación y administración general del viaje dentro de una experiencia unificada.</w:t>
+      </w:r>
+    </w:p>
+    <w:p>
+      <w:pPr>
+        <w:jc w:val="both"/>
+        <w:rPr>
+          <w:rFonts w:asciiTheme="majorHAnsi" w:hAnsiTheme="majorHAnsi" w:cstheme="majorHAnsi"/>
+          <w:lang w:val="es-MX"/>
+        </w:rPr>
+      </w:pPr>
+    </w:p>
+    <w:p>
+      <w:pPr>
+        <w:jc w:val="both"/>
+        <w:rPr>
+          <w:rFonts w:asciiTheme="majorHAnsi" w:hAnsiTheme="majorHAnsi" w:cstheme="majorHAnsi"/>
+          <w:b/>
+          <w:bCs/>
+          <w:sz w:val="24"/>
+          <w:lang w:val="es-MX"/>
+        </w:rPr>
+      </w:pPr>
+      <w:r>
+        <w:rPr>
+          <w:rFonts w:asciiTheme="majorHAnsi" w:hAnsiTheme="majorHAnsi" w:cstheme="majorHAnsi"/>
+          <w:b/>
+          <w:bCs/>
+          <w:sz w:val="24"/>
+          <w:lang w:val="es-MX"/>
+        </w:rPr>
+        <w:t>Integraciones e Incorporaciones Futuras</w:t>
+      </w:r>
+    </w:p>
+    <w:p>
+      <w:pPr>
+        <w:jc w:val="both"/>
+        <w:rPr>
+          <w:rFonts w:asciiTheme="majorHAnsi" w:hAnsiTheme="majorHAnsi" w:cstheme="majorHAnsi"/>
+          <w:b/>
+          <w:bCs/>
+          <w:sz w:val="24"/>
+          <w:lang w:val="es-MX"/>
+        </w:rPr>
+      </w:pPr>
+    </w:p>
+    <w:p>
+      <w:pPr>
+        <w:jc w:val="both"/>
+        <w:rPr>
+          <w:rFonts w:asciiTheme="majorHAnsi" w:hAnsiTheme="majorHAnsi" w:cstheme="majorHAnsi"/>
+          <w:lang w:val="es-MX"/>
+        </w:rPr>
+      </w:pPr>
+      <w:r>
+        <w:rPr>
+          <w:rFonts w:asciiTheme="majorHAnsi" w:hAnsiTheme="majorHAnsi" w:cstheme="majorHAnsi"/>
+          <w:lang w:val="es-MX"/>
+        </w:rPr>
+        <w:t>La arquitectura del sistema se encuentra preparada para incorporar progresivamente nuevos servicios externos destinados a ampliar capacidades operativas, enriquecer la experiencia de planificación y consolidar un ecosistema más completo de herramientas vinculadas a la gestión de viajes. Desde sus primeras etapas, la plataforma se diseña bajo un enfoque modular que permite integrar componentes adicionales sin necesidad de modificar de forma estructural el funcionamiento general del sistema.</w:t>
+      </w:r>
+    </w:p>
+    <w:p>
+      <w:pPr>
+        <w:jc w:val="both"/>
+        <w:rPr>
+          <w:rFonts w:asciiTheme="majorHAnsi" w:hAnsiTheme="majorHAnsi" w:cstheme="majorHAnsi"/>
+          <w:lang w:val="es-MX"/>
+        </w:rPr>
+      </w:pPr>
+      <w:r>
+        <w:rPr>
+          <w:rFonts w:asciiTheme="majorHAnsi" w:hAnsiTheme="majorHAnsi" w:cstheme="majorHAnsi"/>
+          <w:lang w:val="es-MX"/>
+        </w:rPr>
+        <w:t>Esta capacidad de expansión contempla futuras conexiones con compañías de transporte, plataformas de reservas, servicios hoteleros, sistemas de pago, herramientas meteorológicas y proveedores turísticos especializados que puedan complementar el proceso de planificación desarrollado dentro de la plataforma. La incorporación de estos servicios permitiría centralizar aún más operaciones relacionadas con organización, contratación y administración del viaje dentro de un único entorno operativo.</w:t>
+      </w:r>
+    </w:p>
+    <w:p>
+      <w:pPr>
+        <w:jc w:val="both"/>
+        <w:rPr>
+          <w:rFonts w:asciiTheme="majorHAnsi" w:hAnsiTheme="majorHAnsi" w:cstheme="majorHAnsi"/>
+          <w:lang w:val="es-MX"/>
+        </w:rPr>
+      </w:pPr>
+      <w:r>
+        <w:rPr>
+          <w:rFonts w:asciiTheme="majorHAnsi" w:hAnsiTheme="majorHAnsi" w:cstheme="majorHAnsi"/>
+          <w:lang w:val="es-MX"/>
+        </w:rPr>
+        <w:t>La lógica de integración implementada busca mantener independencia relativa entre cada servicio conectado, permitiendo que nuevas herramientas puedan añadirse, reemplazarse o actualizarse de manera progresiva según necesidades funcionales, disponibilidad tecnológica o crecimiento general del proyecto. Esta separación reduce dependencia directa entre componentes y facilita adaptación frente a futuras modificaciones del ecosistema externo utilizado por la plataforma.</w:t>
+      </w:r>
+    </w:p>
+    <w:p>
+      <w:pPr>
+        <w:jc w:val="both"/>
+        <w:rPr>
+          <w:rFonts w:asciiTheme="majorHAnsi" w:hAnsiTheme="majorHAnsi" w:cstheme="majorHAnsi"/>
+          <w:lang w:val="es-MX"/>
+        </w:rPr>
+      </w:pPr>
+      <w:r>
+        <w:rPr>
+          <w:rFonts w:asciiTheme="majorHAnsi" w:hAnsiTheme="majorHAnsi" w:cstheme="majorHAnsi"/>
+          <w:lang w:val="es-MX"/>
+        </w:rPr>
+        <w:t>A nivel operativo, las futuras integraciones no solo ampliarían funcionalidades disponibles para el usuario, sino que también permitirían construir una experiencia más automatizada y contextualizada. La posibilidad de combinar información proveniente de distintos servicios externos podría facilitar recomendaciones más precisas, sincronización avanzada de actividades, automatización parcial de procesos de organización y una administración más completa del recorrido general del viaje.</w:t>
+      </w:r>
+    </w:p>
+    <w:p>
+      <w:pPr>
+        <w:jc w:val="both"/>
+        <w:rPr>
+          <w:rFonts w:asciiTheme="majorHAnsi" w:hAnsiTheme="majorHAnsi" w:cstheme="majorHAnsi"/>
+          <w:lang w:val="es-MX"/>
+        </w:rPr>
+      </w:pPr>
+      <w:r>
+        <w:rPr>
+          <w:rFonts w:asciiTheme="majorHAnsi" w:hAnsiTheme="majorHAnsi" w:cstheme="majorHAnsi"/>
+          <w:lang w:val="es-MX"/>
+        </w:rPr>
+        <w:t>La preparación para nuevas incorporaciones constituye además uno de los principales criterios de escalabilidad técnica del proyecto. Más que desarrollar una plataforma cerrada con funcionalidades estrictamente limitadas, el sistema busca establecer una base flexible capaz de evolucionar progresivamente junto a nuevas oportunidades de integración y expansión operativa. Bajo esta lógica, la arquitectura no se concibe como una estructura estática, sino como un entorno preparado para adaptarse continuamente al crecimiento funcional y tecnológico del proyecto.</w:t>
+      </w:r>
+    </w:p>
+    <w:p>
+      <w:pPr>
+        <w:rPr>
+          <w:rFonts w:asciiTheme="majorHAnsi" w:hAnsiTheme="majorHAnsi" w:cstheme="majorHAnsi"/>
+          <w:lang w:val="es-MX"/>
+        </w:rPr>
+      </w:pPr>
+      <w:r>
+        <w:rPr>
+          <w:rFonts w:asciiTheme="majorHAnsi" w:hAnsiTheme="majorHAnsi" w:cstheme="majorHAnsi"/>
+          <w:lang w:val="es-MX"/>
+        </w:rPr>
+        <w:br w:type="page"/>
+      </w:r>
+    </w:p>
+    <w:p>
+      <w:pPr>
+        <w:jc w:val="both"/>
+        <w:rPr>
+          <w:rFonts w:ascii="Bookman Old Style" w:hAnsi="Bookman Old Style"/>
+          <w:b/>
+          <w:sz w:val="28"/>
+          <w:lang w:val="es-MX"/>
+        </w:rPr>
+      </w:pPr>
+    </w:p>
+    <w:p>
+      <w:pPr>
+        <w:jc w:val="both"/>
+        <w:rPr>
+          <w:rFonts w:ascii="Bookman Old Style" w:hAnsi="Bookman Old Style"/>
+          <w:b/>
+          <w:sz w:val="28"/>
+          <w:lang w:val="es-MX"/>
+        </w:rPr>
+      </w:pPr>
+    </w:p>
+    <w:p>
+      <w:pPr>
+        <w:jc w:val="both"/>
+        <w:rPr>
+          <w:rFonts w:ascii="Bookman Old Style" w:hAnsi="Bookman Old Style"/>
+          <w:b/>
+          <w:sz w:val="28"/>
+          <w:lang w:val="es-MX"/>
+        </w:rPr>
+      </w:pPr>
+    </w:p>
+    <w:p>
+      <w:pPr>
+        <w:jc w:val="both"/>
+        <w:rPr>
+          <w:rFonts w:ascii="Bookman Old Style" w:hAnsi="Bookman Old Style"/>
+          <w:b/>
+          <w:sz w:val="28"/>
+          <w:lang w:val="es-MX"/>
+        </w:rPr>
+      </w:pPr>
+      <w:r>
+        <w:rPr>
+          <w:rFonts w:ascii="Bookman Old Style" w:hAnsi="Bookman Old Style"/>
+          <w:b/>
+          <w:sz w:val="28"/>
+          <w:lang w:val="es-MX"/>
+        </w:rPr>
+        <w:t>7</w:t>
+      </w:r>
+    </w:p>
+    <w:p>
+      <w:pPr>
+        <w:jc w:val="both"/>
+        <w:rPr>
+          <w:rFonts w:ascii="Bookman Old Style" w:hAnsi="Bookman Old Style"/>
+          <w:b/>
+          <w:sz w:val="28"/>
+          <w:lang w:val="es-MX"/>
+        </w:rPr>
+      </w:pPr>
+    </w:p>
+    <w:p>
+      <w:pPr>
+        <w:jc w:val="both"/>
+        <w:rPr>
+          <w:rFonts w:ascii="Bookman Old Style" w:hAnsi="Bookman Old Style"/>
+          <w:b/>
+          <w:sz w:val="12"/>
+          <w:lang w:val="es-MX"/>
+        </w:rPr>
+      </w:pPr>
+    </w:p>
+    <w:p>
+      <w:pPr>
+        <w:jc w:val="both"/>
+        <w:rPr>
+          <w:rFonts w:ascii="Bookman Old Style" w:hAnsi="Bookman Old Style"/>
+          <w:b/>
+          <w:sz w:val="28"/>
+          <w:lang w:val="es-MX"/>
+        </w:rPr>
+      </w:pPr>
+      <w:r>
+        <w:rPr>
+          <w:rFonts w:ascii="Bookman Old Style" w:hAnsi="Bookman Old Style"/>
+          <w:b/>
+          <w:sz w:val="28"/>
+        </w:rPr>
+        <w:t>M</w:t>
+      </w:r>
+      <w:r>
+        <w:rPr>
+          <w:rFonts w:ascii="Bookman Old Style" w:hAnsi="Bookman Old Style"/>
+          <w:b/>
+          <w:sz w:val="28"/>
+        </w:rPr>
+        <w:t>odelo Operativo</w:t>
+      </w:r>
+    </w:p>
+    <w:p>
+      <w:pPr>
+        <w:jc w:val="both"/>
+        <w:rPr>
+          <w:rFonts w:ascii="Bookman Old Style" w:hAnsi="Bookman Old Style"/>
+          <w:b/>
+          <w:sz w:val="28"/>
+          <w:lang w:val="es-MX"/>
+        </w:rPr>
+      </w:pPr>
+    </w:p>
+    <w:p>
+      <w:pPr>
+        <w:jc w:val="both"/>
+        <w:rPr>
+          <w:rFonts w:ascii="Bookman Old Style" w:hAnsi="Bookman Old Style"/>
+          <w:b/>
+          <w:sz w:val="28"/>
+          <w:lang w:val="es-MX"/>
+        </w:rPr>
+      </w:pPr>
+    </w:p>
+    <w:p>
+      <w:pPr>
+        <w:jc w:val="both"/>
+        <w:rPr>
+          <w:rFonts w:ascii="Bookman Old Style" w:hAnsi="Bookman Old Style"/>
+          <w:b/>
+          <w:sz w:val="28"/>
+          <w:lang w:val="es-MX"/>
+        </w:rPr>
+      </w:pPr>
+    </w:p>
+    <w:p>
+      <w:pPr>
+        <w:jc w:val="both"/>
+        <w:rPr>
+          <w:rFonts w:asciiTheme="majorHAnsi" w:hAnsiTheme="majorHAnsi" w:cstheme="majorHAnsi"/>
+          <w:lang w:val="es-MX"/>
+        </w:rPr>
+      </w:pPr>
+      <w:r>
+        <w:rPr>
+          <w:rFonts w:asciiTheme="majorHAnsi" w:hAnsiTheme="majorHAnsi" w:cstheme="majorHAnsi"/>
+          <w:lang w:val="es-MX"/>
+        </w:rPr>
+        <w:t>El modelo operativo de la plataforma se encuentra orientado a centralizar y coordinar los distintos procesos vinculados a la planificación, organización y administración general de viajes dentro de un único entorno integrado. Más allá de las funcionalidades técnicas implementadas a nivel de infraestructura y desarrollo, el sistema se concibe como una plataforma capaz de conectar usuarios, servicios externos y futuras compañías asociadas mediante una estructura operativa unificada y adaptable.</w:t>
+      </w:r>
+    </w:p>
+    <w:p>
+      <w:pPr>
+        <w:jc w:val="both"/>
+        <w:rPr>
+          <w:rFonts w:asciiTheme="majorHAnsi" w:hAnsiTheme="majorHAnsi" w:cstheme="majorHAnsi"/>
+          <w:lang w:val="es-MX"/>
+        </w:rPr>
+      </w:pPr>
+      <w:r>
+        <w:rPr>
+          <w:rFonts w:asciiTheme="majorHAnsi" w:hAnsiTheme="majorHAnsi" w:cstheme="majorHAnsi"/>
+          <w:lang w:val="es-MX"/>
+        </w:rPr>
+        <w:t>Dentro de esta lógica, la aplicación no funciona únicamente como una herramienta de organización individual, sino como un entorno capaz de administrar múltiples flujos de interacción relacionados con itinerarios, actividades, reservas, sincronización de información y personalización de experiencias. La combinación entre planificación dinámica, persistencia de datos e integración con servicios externos permite construir un modelo donde distintos componentes operan coordinadamente dentro de una misma estructura funcional.</w:t>
+      </w:r>
+    </w:p>
+    <w:p>
+      <w:pPr>
+        <w:jc w:val="both"/>
+        <w:rPr>
+          <w:rFonts w:asciiTheme="majorHAnsi" w:hAnsiTheme="majorHAnsi" w:cstheme="majorHAnsi"/>
+          <w:lang w:val="es-MX"/>
+        </w:rPr>
+      </w:pPr>
+      <w:r>
+        <w:rPr>
+          <w:rFonts w:asciiTheme="majorHAnsi" w:hAnsiTheme="majorHAnsi" w:cstheme="majorHAnsi"/>
+          <w:lang w:val="es-MX"/>
+        </w:rPr>
+        <w:t>El funcionamiento operativo del sistema se basa en una relación continua entre usuario, plataforma y servicios integrados. A medida que el viaje evoluciona, la aplicación puede reorganizar información, sincronizar actividades, incorporar contenido contextual y facilitar futuras interacciones con proveedores externos vinculados al ecosistema turístico. Esto permite que gran parte de los procesos asociados a planificación y gestión del recorrido puedan administrarse desde un entorno centralizado sin depender de herramientas dispersas o plataformas separadas.</w:t>
+      </w:r>
+    </w:p>
+    <w:p>
+      <w:pPr>
+        <w:jc w:val="both"/>
+        <w:rPr>
+          <w:rFonts w:asciiTheme="majorHAnsi" w:hAnsiTheme="majorHAnsi" w:cstheme="majorHAnsi"/>
+          <w:lang w:val="es-MX"/>
+        </w:rPr>
+      </w:pPr>
+      <w:bookmarkStart w:id="0" w:name="_GoBack"/>
+      <w:bookmarkEnd w:id="0"/>
     </w:p>
     <w:sectPr>
       <w:pgSz w:w="11909" w:h="16834"/>
@@ -5549,7 +7540,7 @@
   </w:latentStyles>
   <w:style w:type="paragraph" w:default="1" w:styleId="Normal">
     <w:name w:val="Normal"/>
-    <w:rsid w:val="00BD2CBF"/>
+    <w:rsid w:val="00D343E7"/>
   </w:style>
   <w:style w:type="paragraph" w:styleId="Ttulo1">
     <w:name w:val="heading 1"/>
@@ -5646,7 +7637,6 @@
   <w:style w:type="character" w:default="1" w:styleId="Fuentedeprrafopredeter">
     <w:name w:val="Default Paragraph Font"/>
     <w:uiPriority w:val="1"/>
-    <w:semiHidden/>
     <w:unhideWhenUsed/>
   </w:style>
   <w:style w:type="table" w:default="1" w:styleId="Tablanormal">
@@ -6150,7 +8140,7 @@
 </file>
 
 <file path=customXml/itemProps1.xml><?xml version="1.0" encoding="utf-8"?>
-<ds:datastoreItem xmlns:ds="http://schemas.openxmlformats.org/officeDocument/2006/customXml" ds:itemID="{EEB5CCA1-2B23-43B2-90C5-75EB06F49BCD}">
+<ds:datastoreItem xmlns:ds="http://schemas.openxmlformats.org/officeDocument/2006/customXml" ds:itemID="{1D8F3C9B-9986-4E11-BF90-DBFF3836FC2C}">
   <ds:schemaRefs>
     <ds:schemaRef ds:uri="http://schemas.openxmlformats.org/officeDocument/2006/bibliography"/>
   </ds:schemaRefs>

</xml_diff>